<commit_message>
Auto sync: 2026-01-22 13:38:08
</commit_message>
<xml_diff>
--- a/TABLES/Table1.docx
+++ b/TABLES/Table1.docx
@@ -37,9 +37,9 @@
       <w:tblGrid>
         <w:gridCol w:w="4165"/>
         <w:gridCol w:w="1156"/>
-        <w:gridCol w:w="3102"/>
-        <w:gridCol w:w="2980"/>
-        <w:gridCol w:w="2954"/>
+        <w:gridCol w:w="3126"/>
+        <w:gridCol w:w="3004"/>
+        <w:gridCol w:w="2978"/>
       </w:tblGrid>
       <w:tr>
         <w:trPr>
@@ -313,7 +313,7 @@
                 <w:szCs w:val="22"/>
                 <w:color w:val="000000"/>
               </w:rPr>
-              <w:t xml:space="preserve">Group difference [95% CI]</w:t>
+              <w:t xml:space="preserve">Group difference (95% CI)</w:t>
             </w:r>
           </w:p>
         </w:tc>
@@ -589,7 +589,7 @@
                 <w:szCs w:val="22"/>
                 <w:color w:val="000000"/>
               </w:rPr>
-              <w:t xml:space="preserve">NA</w:t>
+              <w:t xml:space="preserve"/>
             </w:r>
           </w:p>
         </w:tc>
@@ -1033,115 +1033,115 @@
                 <w:szCs w:val="22"/>
                 <w:color w:val="000000"/>
               </w:rPr>
-              <w:t xml:space="preserve">   60.0 [53.0 – 67.5]</w:t>
-            </w:r>
-          </w:p>
-        </w:tc>
-        <w:tc>
-          <w:tcPr>
-            <w:tcBorders>
-              <w:bottom w:val="none" w:sz="0" w:space="0" w:color="000000"/>
-              <w:top w:val="none" w:sz="0" w:space="0" w:color="000000"/>
-              <w:left w:val="none" w:sz="0" w:space="0" w:color="000000"/>
-              <w:right w:val="none" w:sz="0" w:space="0" w:color="000000"/>
-            </w:tcBorders>
-            <w:shd w:val="clear" w:color="auto" w:fill="FFFFFF"/>
-            <w:tcMar>
-              <w:top w:w="0" w:type="dxa"/>
-              <w:bottom w:w="0" w:type="dxa"/>
-              <w:left w:w="0" w:type="dxa"/>
-              <w:right w:w="0" w:type="dxa"/>
-            </w:tcMar>
-            <w:vAlign w:val="center"/>
-          </w:tcPr>
-          <w:p>
-            <w:pPr>
-              <w:jc w:val="center"/>
-              <w:pBdr>
-                <w:bottom w:val="none" w:sz="0" w:space="0" w:color="000000"/>
-                <w:top w:val="none" w:sz="0" w:space="0" w:color="000000"/>
-                <w:left w:val="none" w:sz="0" w:space="0" w:color="000000"/>
-                <w:right w:val="none" w:sz="0" w:space="0" w:color="000000"/>
-              </w:pBdr>
-              <w:spacing w:after="100" w:before="100" w:line="240"/>
-              <w:ind w:left="100" w:right="100" w:firstLine="0" w:firstLineChars="0"/>
-              <w:rPr>
-                <w:rFonts w:ascii="Helvetica" w:hAnsi="Helvetica" w:eastAsia="Helvetica" w:cs="Helvetica"/>
-                <w:i w:val="false"/>
-                <w:b w:val="false"/>
-                <w:u w:val="none"/>
-                <w:strike w:val="false"/>
-                <w:sz w:val="22"/>
-                <w:szCs w:val="22"/>
-                <w:color w:val="000000"/>
-              </w:rPr>
-            </w:pPr>
-            <w:r>
-              <w:rPr>
-                <w:rFonts w:ascii="Helvetica" w:hAnsi="Helvetica" w:eastAsia="Helvetica" w:cs="Helvetica"/>
-                <w:i w:val="false"/>
-                <w:b w:val="false"/>
-                <w:u w:val="none"/>
-                <w:strike w:val="false"/>
-                <w:sz w:val="22"/>
-                <w:szCs w:val="22"/>
-                <w:color w:val="000000"/>
-              </w:rPr>
-              <w:t xml:space="preserve">  59.0 [48.8 – 64.5]</w:t>
-            </w:r>
-          </w:p>
-        </w:tc>
-        <w:tc>
-          <w:tcPr>
-            <w:tcBorders>
-              <w:bottom w:val="none" w:sz="0" w:space="0" w:color="000000"/>
-              <w:top w:val="none" w:sz="0" w:space="0" w:color="000000"/>
-              <w:left w:val="none" w:sz="0" w:space="0" w:color="000000"/>
-              <w:right w:val="none" w:sz="0" w:space="0" w:color="000000"/>
-            </w:tcBorders>
-            <w:shd w:val="clear" w:color="auto" w:fill="FFFFFF"/>
-            <w:tcMar>
-              <w:top w:w="0" w:type="dxa"/>
-              <w:bottom w:w="0" w:type="dxa"/>
-              <w:left w:w="0" w:type="dxa"/>
-              <w:right w:w="0" w:type="dxa"/>
-            </w:tcMar>
-            <w:vAlign w:val="center"/>
-          </w:tcPr>
-          <w:p>
-            <w:pPr>
-              <w:jc w:val="center"/>
-              <w:pBdr>
-                <w:bottom w:val="none" w:sz="0" w:space="0" w:color="000000"/>
-                <w:top w:val="none" w:sz="0" w:space="0" w:color="000000"/>
-                <w:left w:val="none" w:sz="0" w:space="0" w:color="000000"/>
-                <w:right w:val="none" w:sz="0" w:space="0" w:color="000000"/>
-              </w:pBdr>
-              <w:spacing w:after="100" w:before="100" w:line="240"/>
-              <w:ind w:left="100" w:right="100" w:firstLine="0" w:firstLineChars="0"/>
-              <w:rPr>
-                <w:rFonts w:ascii="Helvetica" w:hAnsi="Helvetica" w:eastAsia="Helvetica" w:cs="Helvetica"/>
-                <w:i w:val="false"/>
-                <w:b w:val="false"/>
-                <w:u w:val="none"/>
-                <w:strike w:val="false"/>
-                <w:sz w:val="22"/>
-                <w:szCs w:val="22"/>
-                <w:color w:val="000000"/>
-              </w:rPr>
-            </w:pPr>
-            <w:r>
-              <w:rPr>
-                <w:rFonts w:ascii="Helvetica" w:hAnsi="Helvetica" w:eastAsia="Helvetica" w:cs="Helvetica"/>
-                <w:i w:val="false"/>
-                <w:b w:val="false"/>
-                <w:u w:val="none"/>
-                <w:strike w:val="false"/>
-                <w:sz w:val="22"/>
-                <w:szCs w:val="22"/>
-                <w:color w:val="000000"/>
-              </w:rPr>
-              <w:t xml:space="preserve">1 [-6 – 9]</w:t>
+              <w:t xml:space="preserve">   60.0 (53.0 – 67.5)</w:t>
+            </w:r>
+          </w:p>
+        </w:tc>
+        <w:tc>
+          <w:tcPr>
+            <w:tcBorders>
+              <w:bottom w:val="none" w:sz="0" w:space="0" w:color="000000"/>
+              <w:top w:val="none" w:sz="0" w:space="0" w:color="000000"/>
+              <w:left w:val="none" w:sz="0" w:space="0" w:color="000000"/>
+              <w:right w:val="none" w:sz="0" w:space="0" w:color="000000"/>
+            </w:tcBorders>
+            <w:shd w:val="clear" w:color="auto" w:fill="FFFFFF"/>
+            <w:tcMar>
+              <w:top w:w="0" w:type="dxa"/>
+              <w:bottom w:w="0" w:type="dxa"/>
+              <w:left w:w="0" w:type="dxa"/>
+              <w:right w:w="0" w:type="dxa"/>
+            </w:tcMar>
+            <w:vAlign w:val="center"/>
+          </w:tcPr>
+          <w:p>
+            <w:pPr>
+              <w:jc w:val="center"/>
+              <w:pBdr>
+                <w:bottom w:val="none" w:sz="0" w:space="0" w:color="000000"/>
+                <w:top w:val="none" w:sz="0" w:space="0" w:color="000000"/>
+                <w:left w:val="none" w:sz="0" w:space="0" w:color="000000"/>
+                <w:right w:val="none" w:sz="0" w:space="0" w:color="000000"/>
+              </w:pBdr>
+              <w:spacing w:after="100" w:before="100" w:line="240"/>
+              <w:ind w:left="100" w:right="100" w:firstLine="0" w:firstLineChars="0"/>
+              <w:rPr>
+                <w:rFonts w:ascii="Helvetica" w:hAnsi="Helvetica" w:eastAsia="Helvetica" w:cs="Helvetica"/>
+                <w:i w:val="false"/>
+                <w:b w:val="false"/>
+                <w:u w:val="none"/>
+                <w:strike w:val="false"/>
+                <w:sz w:val="22"/>
+                <w:szCs w:val="22"/>
+                <w:color w:val="000000"/>
+              </w:rPr>
+            </w:pPr>
+            <w:r>
+              <w:rPr>
+                <w:rFonts w:ascii="Helvetica" w:hAnsi="Helvetica" w:eastAsia="Helvetica" w:cs="Helvetica"/>
+                <w:i w:val="false"/>
+                <w:b w:val="false"/>
+                <w:u w:val="none"/>
+                <w:strike w:val="false"/>
+                <w:sz w:val="22"/>
+                <w:szCs w:val="22"/>
+                <w:color w:val="000000"/>
+              </w:rPr>
+              <w:t xml:space="preserve">  59.0 (48.8 – 64.5)</w:t>
+            </w:r>
+          </w:p>
+        </w:tc>
+        <w:tc>
+          <w:tcPr>
+            <w:tcBorders>
+              <w:bottom w:val="none" w:sz="0" w:space="0" w:color="000000"/>
+              <w:top w:val="none" w:sz="0" w:space="0" w:color="000000"/>
+              <w:left w:val="none" w:sz="0" w:space="0" w:color="000000"/>
+              <w:right w:val="none" w:sz="0" w:space="0" w:color="000000"/>
+            </w:tcBorders>
+            <w:shd w:val="clear" w:color="auto" w:fill="FFFFFF"/>
+            <w:tcMar>
+              <w:top w:w="0" w:type="dxa"/>
+              <w:bottom w:w="0" w:type="dxa"/>
+              <w:left w:w="0" w:type="dxa"/>
+              <w:right w:w="0" w:type="dxa"/>
+            </w:tcMar>
+            <w:vAlign w:val="center"/>
+          </w:tcPr>
+          <w:p>
+            <w:pPr>
+              <w:jc w:val="center"/>
+              <w:pBdr>
+                <w:bottom w:val="none" w:sz="0" w:space="0" w:color="000000"/>
+                <w:top w:val="none" w:sz="0" w:space="0" w:color="000000"/>
+                <w:left w:val="none" w:sz="0" w:space="0" w:color="000000"/>
+                <w:right w:val="none" w:sz="0" w:space="0" w:color="000000"/>
+              </w:pBdr>
+              <w:spacing w:after="100" w:before="100" w:line="240"/>
+              <w:ind w:left="100" w:right="100" w:firstLine="0" w:firstLineChars="0"/>
+              <w:rPr>
+                <w:rFonts w:ascii="Helvetica" w:hAnsi="Helvetica" w:eastAsia="Helvetica" w:cs="Helvetica"/>
+                <w:i w:val="false"/>
+                <w:b w:val="false"/>
+                <w:u w:val="none"/>
+                <w:strike w:val="false"/>
+                <w:sz w:val="22"/>
+                <w:szCs w:val="22"/>
+                <w:color w:val="000000"/>
+              </w:rPr>
+            </w:pPr>
+            <w:r>
+              <w:rPr>
+                <w:rFonts w:ascii="Helvetica" w:hAnsi="Helvetica" w:eastAsia="Helvetica" w:cs="Helvetica"/>
+                <w:i w:val="false"/>
+                <w:b w:val="false"/>
+                <w:u w:val="none"/>
+                <w:strike w:val="false"/>
+                <w:sz w:val="22"/>
+                <w:szCs w:val="22"/>
+                <w:color w:val="000000"/>
+              </w:rPr>
+              <w:t xml:space="preserve">1 (-6 – 9)</w:t>
             </w:r>
           </w:p>
         </w:tc>
@@ -1417,7 +1417,7 @@
                 <w:szCs w:val="22"/>
                 <w:color w:val="000000"/>
               </w:rPr>
-              <w:t xml:space="preserve">-13 [-33 – +8]</w:t>
+              <w:t xml:space="preserve">-13 (-33 – +8)</w:t>
             </w:r>
           </w:p>
         </w:tc>
@@ -1585,115 +1585,115 @@
                 <w:szCs w:val="22"/>
                 <w:color w:val="000000"/>
               </w:rPr>
-              <w:t xml:space="preserve">   28.1 [22.9 – 31.9]</w:t>
-            </w:r>
-          </w:p>
-        </w:tc>
-        <w:tc>
-          <w:tcPr>
-            <w:tcBorders>
-              <w:bottom w:val="none" w:sz="0" w:space="0" w:color="000000"/>
-              <w:top w:val="none" w:sz="0" w:space="0" w:color="000000"/>
-              <w:left w:val="none" w:sz="0" w:space="0" w:color="000000"/>
-              <w:right w:val="none" w:sz="0" w:space="0" w:color="000000"/>
-            </w:tcBorders>
-            <w:shd w:val="clear" w:color="auto" w:fill="FFFFFF"/>
-            <w:tcMar>
-              <w:top w:w="0" w:type="dxa"/>
-              <w:bottom w:w="0" w:type="dxa"/>
-              <w:left w:w="0" w:type="dxa"/>
-              <w:right w:w="0" w:type="dxa"/>
-            </w:tcMar>
-            <w:vAlign w:val="center"/>
-          </w:tcPr>
-          <w:p>
-            <w:pPr>
-              <w:jc w:val="center"/>
-              <w:pBdr>
-                <w:bottom w:val="none" w:sz="0" w:space="0" w:color="000000"/>
-                <w:top w:val="none" w:sz="0" w:space="0" w:color="000000"/>
-                <w:left w:val="none" w:sz="0" w:space="0" w:color="000000"/>
-                <w:right w:val="none" w:sz="0" w:space="0" w:color="000000"/>
-              </w:pBdr>
-              <w:spacing w:after="100" w:before="100" w:line="240"/>
-              <w:ind w:left="100" w:right="100" w:firstLine="0" w:firstLineChars="0"/>
-              <w:rPr>
-                <w:rFonts w:ascii="Helvetica" w:hAnsi="Helvetica" w:eastAsia="Helvetica" w:cs="Helvetica"/>
-                <w:i w:val="false"/>
-                <w:b w:val="false"/>
-                <w:u w:val="none"/>
-                <w:strike w:val="false"/>
-                <w:sz w:val="22"/>
-                <w:szCs w:val="22"/>
-                <w:color w:val="000000"/>
-              </w:rPr>
-            </w:pPr>
-            <w:r>
-              <w:rPr>
-                <w:rFonts w:ascii="Helvetica" w:hAnsi="Helvetica" w:eastAsia="Helvetica" w:cs="Helvetica"/>
-                <w:i w:val="false"/>
-                <w:b w:val="false"/>
-                <w:u w:val="none"/>
-                <w:strike w:val="false"/>
-                <w:sz w:val="22"/>
-                <w:szCs w:val="22"/>
-                <w:color w:val="000000"/>
-              </w:rPr>
-              <w:t xml:space="preserve">  26.0 [24.9 – 28.6]</w:t>
-            </w:r>
-          </w:p>
-        </w:tc>
-        <w:tc>
-          <w:tcPr>
-            <w:tcBorders>
-              <w:bottom w:val="none" w:sz="0" w:space="0" w:color="000000"/>
-              <w:top w:val="none" w:sz="0" w:space="0" w:color="000000"/>
-              <w:left w:val="none" w:sz="0" w:space="0" w:color="000000"/>
-              <w:right w:val="none" w:sz="0" w:space="0" w:color="000000"/>
-            </w:tcBorders>
-            <w:shd w:val="clear" w:color="auto" w:fill="FFFFFF"/>
-            <w:tcMar>
-              <w:top w:w="0" w:type="dxa"/>
-              <w:bottom w:w="0" w:type="dxa"/>
-              <w:left w:w="0" w:type="dxa"/>
-              <w:right w:w="0" w:type="dxa"/>
-            </w:tcMar>
-            <w:vAlign w:val="center"/>
-          </w:tcPr>
-          <w:p>
-            <w:pPr>
-              <w:jc w:val="center"/>
-              <w:pBdr>
-                <w:bottom w:val="none" w:sz="0" w:space="0" w:color="000000"/>
-                <w:top w:val="none" w:sz="0" w:space="0" w:color="000000"/>
-                <w:left w:val="none" w:sz="0" w:space="0" w:color="000000"/>
-                <w:right w:val="none" w:sz="0" w:space="0" w:color="000000"/>
-              </w:pBdr>
-              <w:spacing w:after="100" w:before="100" w:line="240"/>
-              <w:ind w:left="100" w:right="100" w:firstLine="0" w:firstLineChars="0"/>
-              <w:rPr>
-                <w:rFonts w:ascii="Helvetica" w:hAnsi="Helvetica" w:eastAsia="Helvetica" w:cs="Helvetica"/>
-                <w:i w:val="false"/>
-                <w:b w:val="false"/>
-                <w:u w:val="none"/>
-                <w:strike w:val="false"/>
-                <w:sz w:val="22"/>
-                <w:szCs w:val="22"/>
-                <w:color w:val="000000"/>
-              </w:rPr>
-            </w:pPr>
-            <w:r>
-              <w:rPr>
-                <w:rFonts w:ascii="Helvetica" w:hAnsi="Helvetica" w:eastAsia="Helvetica" w:cs="Helvetica"/>
-                <w:i w:val="false"/>
-                <w:b w:val="false"/>
-                <w:u w:val="none"/>
-                <w:strike w:val="false"/>
-                <w:sz w:val="22"/>
-                <w:szCs w:val="22"/>
-                <w:color w:val="000000"/>
-              </w:rPr>
-              <w:t xml:space="preserve">2 [-2 – 6]</w:t>
+              <w:t xml:space="preserve">   28.1 (22.9 – 31.9)</w:t>
+            </w:r>
+          </w:p>
+        </w:tc>
+        <w:tc>
+          <w:tcPr>
+            <w:tcBorders>
+              <w:bottom w:val="none" w:sz="0" w:space="0" w:color="000000"/>
+              <w:top w:val="none" w:sz="0" w:space="0" w:color="000000"/>
+              <w:left w:val="none" w:sz="0" w:space="0" w:color="000000"/>
+              <w:right w:val="none" w:sz="0" w:space="0" w:color="000000"/>
+            </w:tcBorders>
+            <w:shd w:val="clear" w:color="auto" w:fill="FFFFFF"/>
+            <w:tcMar>
+              <w:top w:w="0" w:type="dxa"/>
+              <w:bottom w:w="0" w:type="dxa"/>
+              <w:left w:w="0" w:type="dxa"/>
+              <w:right w:w="0" w:type="dxa"/>
+            </w:tcMar>
+            <w:vAlign w:val="center"/>
+          </w:tcPr>
+          <w:p>
+            <w:pPr>
+              <w:jc w:val="center"/>
+              <w:pBdr>
+                <w:bottom w:val="none" w:sz="0" w:space="0" w:color="000000"/>
+                <w:top w:val="none" w:sz="0" w:space="0" w:color="000000"/>
+                <w:left w:val="none" w:sz="0" w:space="0" w:color="000000"/>
+                <w:right w:val="none" w:sz="0" w:space="0" w:color="000000"/>
+              </w:pBdr>
+              <w:spacing w:after="100" w:before="100" w:line="240"/>
+              <w:ind w:left="100" w:right="100" w:firstLine="0" w:firstLineChars="0"/>
+              <w:rPr>
+                <w:rFonts w:ascii="Helvetica" w:hAnsi="Helvetica" w:eastAsia="Helvetica" w:cs="Helvetica"/>
+                <w:i w:val="false"/>
+                <w:b w:val="false"/>
+                <w:u w:val="none"/>
+                <w:strike w:val="false"/>
+                <w:sz w:val="22"/>
+                <w:szCs w:val="22"/>
+                <w:color w:val="000000"/>
+              </w:rPr>
+            </w:pPr>
+            <w:r>
+              <w:rPr>
+                <w:rFonts w:ascii="Helvetica" w:hAnsi="Helvetica" w:eastAsia="Helvetica" w:cs="Helvetica"/>
+                <w:i w:val="false"/>
+                <w:b w:val="false"/>
+                <w:u w:val="none"/>
+                <w:strike w:val="false"/>
+                <w:sz w:val="22"/>
+                <w:szCs w:val="22"/>
+                <w:color w:val="000000"/>
+              </w:rPr>
+              <w:t xml:space="preserve">  26.0 (24.9 – 28.6)</w:t>
+            </w:r>
+          </w:p>
+        </w:tc>
+        <w:tc>
+          <w:tcPr>
+            <w:tcBorders>
+              <w:bottom w:val="none" w:sz="0" w:space="0" w:color="000000"/>
+              <w:top w:val="none" w:sz="0" w:space="0" w:color="000000"/>
+              <w:left w:val="none" w:sz="0" w:space="0" w:color="000000"/>
+              <w:right w:val="none" w:sz="0" w:space="0" w:color="000000"/>
+            </w:tcBorders>
+            <w:shd w:val="clear" w:color="auto" w:fill="FFFFFF"/>
+            <w:tcMar>
+              <w:top w:w="0" w:type="dxa"/>
+              <w:bottom w:w="0" w:type="dxa"/>
+              <w:left w:w="0" w:type="dxa"/>
+              <w:right w:w="0" w:type="dxa"/>
+            </w:tcMar>
+            <w:vAlign w:val="center"/>
+          </w:tcPr>
+          <w:p>
+            <w:pPr>
+              <w:jc w:val="center"/>
+              <w:pBdr>
+                <w:bottom w:val="none" w:sz="0" w:space="0" w:color="000000"/>
+                <w:top w:val="none" w:sz="0" w:space="0" w:color="000000"/>
+                <w:left w:val="none" w:sz="0" w:space="0" w:color="000000"/>
+                <w:right w:val="none" w:sz="0" w:space="0" w:color="000000"/>
+              </w:pBdr>
+              <w:spacing w:after="100" w:before="100" w:line="240"/>
+              <w:ind w:left="100" w:right="100" w:firstLine="0" w:firstLineChars="0"/>
+              <w:rPr>
+                <w:rFonts w:ascii="Helvetica" w:hAnsi="Helvetica" w:eastAsia="Helvetica" w:cs="Helvetica"/>
+                <w:i w:val="false"/>
+                <w:b w:val="false"/>
+                <w:u w:val="none"/>
+                <w:strike w:val="false"/>
+                <w:sz w:val="22"/>
+                <w:szCs w:val="22"/>
+                <w:color w:val="000000"/>
+              </w:rPr>
+            </w:pPr>
+            <w:r>
+              <w:rPr>
+                <w:rFonts w:ascii="Helvetica" w:hAnsi="Helvetica" w:eastAsia="Helvetica" w:cs="Helvetica"/>
+                <w:i w:val="false"/>
+                <w:b w:val="false"/>
+                <w:u w:val="none"/>
+                <w:strike w:val="false"/>
+                <w:sz w:val="22"/>
+                <w:szCs w:val="22"/>
+                <w:color w:val="000000"/>
+              </w:rPr>
+              <w:t xml:space="preserve">2 (-2 – 6)</w:t>
             </w:r>
           </w:p>
         </w:tc>
@@ -2245,7 +2245,7 @@
                 <w:szCs w:val="22"/>
                 <w:color w:val="000000"/>
               </w:rPr>
-              <w:t xml:space="preserve">-10 [-36 – +17]</w:t>
+              <w:t xml:space="preserve">-10 (-36 – +17)</w:t>
             </w:r>
           </w:p>
         </w:tc>
@@ -2521,7 +2521,7 @@
                 <w:szCs w:val="22"/>
                 <w:color w:val="000000"/>
               </w:rPr>
-              <w:t xml:space="preserve">-5 [-27 – +18]</w:t>
+              <w:t xml:space="preserve">-5 (-27 – +18)</w:t>
             </w:r>
           </w:p>
         </w:tc>
@@ -2797,7 +2797,7 @@
                 <w:szCs w:val="22"/>
                 <w:color w:val="000000"/>
               </w:rPr>
-              <w:t xml:space="preserve">+7 [-20 – +33]</w:t>
+              <w:t xml:space="preserve">+7 (-20 – +33)</w:t>
             </w:r>
           </w:p>
         </w:tc>
@@ -3073,7 +3073,7 @@
                 <w:szCs w:val="22"/>
                 <w:color w:val="000000"/>
               </w:rPr>
-              <w:t xml:space="preserve">-13 [-31 – +6]</w:t>
+              <w:t xml:space="preserve">-13 (-31 – +6)</w:t>
             </w:r>
           </w:p>
         </w:tc>
@@ -3349,7 +3349,7 @@
                 <w:szCs w:val="22"/>
                 <w:color w:val="000000"/>
               </w:rPr>
-              <w:t xml:space="preserve">-4 [-21 – +12]</w:t>
+              <w:t xml:space="preserve">-4 (-21 – +12)</w:t>
             </w:r>
           </w:p>
         </w:tc>
@@ -3625,7 +3625,7 @@
                 <w:szCs w:val="22"/>
                 <w:color w:val="000000"/>
               </w:rPr>
-              <w:t xml:space="preserve">-17 [-34 – +1]</w:t>
+              <w:t xml:space="preserve">-17 (-34 – +1)</w:t>
             </w:r>
           </w:p>
         </w:tc>
@@ -3901,7 +3901,7 @@
                 <w:szCs w:val="22"/>
                 <w:color w:val="000000"/>
               </w:rPr>
-              <w:t xml:space="preserve">-0 [-18 – +17]</w:t>
+              <w:t xml:space="preserve">-0 (-18 – +17)</w:t>
             </w:r>
           </w:p>
         </w:tc>
@@ -4453,7 +4453,7 @@
                 <w:szCs w:val="22"/>
                 <w:color w:val="000000"/>
               </w:rPr>
-              <w:t xml:space="preserve">-2 [-29 – +26]</w:t>
+              <w:t xml:space="preserve">-2 (-29 – +26)</w:t>
             </w:r>
           </w:p>
         </w:tc>
@@ -4729,7 +4729,7 @@
                 <w:szCs w:val="22"/>
                 <w:color w:val="000000"/>
               </w:rPr>
-              <w:t xml:space="preserve">-4 [-21 – +12]</w:t>
+              <w:t xml:space="preserve">-4 (-21 – +12)</w:t>
             </w:r>
           </w:p>
         </w:tc>
@@ -5281,7 +5281,7 @@
                 <w:szCs w:val="22"/>
                 <w:color w:val="000000"/>
               </w:rPr>
-              <w:t xml:space="preserve">-1 [-28 – +25]</w:t>
+              <w:t xml:space="preserve">-1 (-28 – +25)</w:t>
             </w:r>
           </w:p>
         </w:tc>
@@ -5557,7 +5557,7 @@
                 <w:szCs w:val="22"/>
                 <w:color w:val="000000"/>
               </w:rPr>
-              <w:t xml:space="preserve">+1 [-25 – +28]</w:t>
+              <w:t xml:space="preserve">+1 (-25 – +28)</w:t>
             </w:r>
           </w:p>
         </w:tc>
@@ -5833,7 +5833,7 @@
                 <w:szCs w:val="22"/>
                 <w:color w:val="000000"/>
               </w:rPr>
-              <w:t xml:space="preserve">-24 [-48 – +5]</w:t>
+              <w:t xml:space="preserve">-24 (-48 – +5)</w:t>
             </w:r>
           </w:p>
         </w:tc>
@@ -6277,115 +6277,115 @@
                 <w:szCs w:val="22"/>
                 <w:color w:val="000000"/>
               </w:rPr>
-              <w:t xml:space="preserve">   92.0 [84.0 – 104.0]</w:t>
-            </w:r>
-          </w:p>
-        </w:tc>
-        <w:tc>
-          <w:tcPr>
-            <w:tcBorders>
-              <w:bottom w:val="none" w:sz="0" w:space="0" w:color="000000"/>
-              <w:top w:val="none" w:sz="0" w:space="0" w:color="000000"/>
-              <w:left w:val="none" w:sz="0" w:space="0" w:color="000000"/>
-              <w:right w:val="none" w:sz="0" w:space="0" w:color="000000"/>
-            </w:tcBorders>
-            <w:shd w:val="clear" w:color="auto" w:fill="FFFFFF"/>
-            <w:tcMar>
-              <w:top w:w="0" w:type="dxa"/>
-              <w:bottom w:w="0" w:type="dxa"/>
-              <w:left w:w="0" w:type="dxa"/>
-              <w:right w:w="0" w:type="dxa"/>
-            </w:tcMar>
-            <w:vAlign w:val="center"/>
-          </w:tcPr>
-          <w:p>
-            <w:pPr>
-              <w:jc w:val="center"/>
-              <w:pBdr>
-                <w:bottom w:val="none" w:sz="0" w:space="0" w:color="000000"/>
-                <w:top w:val="none" w:sz="0" w:space="0" w:color="000000"/>
-                <w:left w:val="none" w:sz="0" w:space="0" w:color="000000"/>
-                <w:right w:val="none" w:sz="0" w:space="0" w:color="000000"/>
-              </w:pBdr>
-              <w:spacing w:after="100" w:before="100" w:line="240"/>
-              <w:ind w:left="100" w:right="100" w:firstLine="0" w:firstLineChars="0"/>
-              <w:rPr>
-                <w:rFonts w:ascii="Helvetica" w:hAnsi="Helvetica" w:eastAsia="Helvetica" w:cs="Helvetica"/>
-                <w:i w:val="false"/>
-                <w:b w:val="false"/>
-                <w:u w:val="none"/>
-                <w:strike w:val="false"/>
-                <w:sz w:val="22"/>
-                <w:szCs w:val="22"/>
-                <w:color w:val="000000"/>
-              </w:rPr>
-            </w:pPr>
-            <w:r>
-              <w:rPr>
-                <w:rFonts w:ascii="Helvetica" w:hAnsi="Helvetica" w:eastAsia="Helvetica" w:cs="Helvetica"/>
-                <w:i w:val="false"/>
-                <w:b w:val="false"/>
-                <w:u w:val="none"/>
-                <w:strike w:val="false"/>
-                <w:sz w:val="22"/>
-                <w:szCs w:val="22"/>
-                <w:color w:val="000000"/>
-              </w:rPr>
-              <w:t xml:space="preserve"> 101.5 [91.8 – 116.2]</w:t>
-            </w:r>
-          </w:p>
-        </w:tc>
-        <w:tc>
-          <w:tcPr>
-            <w:tcBorders>
-              <w:bottom w:val="none" w:sz="0" w:space="0" w:color="000000"/>
-              <w:top w:val="none" w:sz="0" w:space="0" w:color="000000"/>
-              <w:left w:val="none" w:sz="0" w:space="0" w:color="000000"/>
-              <w:right w:val="none" w:sz="0" w:space="0" w:color="000000"/>
-            </w:tcBorders>
-            <w:shd w:val="clear" w:color="auto" w:fill="FFFFFF"/>
-            <w:tcMar>
-              <w:top w:w="0" w:type="dxa"/>
-              <w:bottom w:w="0" w:type="dxa"/>
-              <w:left w:w="0" w:type="dxa"/>
-              <w:right w:w="0" w:type="dxa"/>
-            </w:tcMar>
-            <w:vAlign w:val="center"/>
-          </w:tcPr>
-          <w:p>
-            <w:pPr>
-              <w:jc w:val="center"/>
-              <w:pBdr>
-                <w:bottom w:val="none" w:sz="0" w:space="0" w:color="000000"/>
-                <w:top w:val="none" w:sz="0" w:space="0" w:color="000000"/>
-                <w:left w:val="none" w:sz="0" w:space="0" w:color="000000"/>
-                <w:right w:val="none" w:sz="0" w:space="0" w:color="000000"/>
-              </w:pBdr>
-              <w:spacing w:after="100" w:before="100" w:line="240"/>
-              <w:ind w:left="100" w:right="100" w:firstLine="0" w:firstLineChars="0"/>
-              <w:rPr>
-                <w:rFonts w:ascii="Helvetica" w:hAnsi="Helvetica" w:eastAsia="Helvetica" w:cs="Helvetica"/>
-                <w:i w:val="false"/>
-                <w:b w:val="false"/>
-                <w:u w:val="none"/>
-                <w:strike w:val="false"/>
-                <w:sz w:val="22"/>
-                <w:szCs w:val="22"/>
-                <w:color w:val="000000"/>
-              </w:rPr>
-            </w:pPr>
-            <w:r>
-              <w:rPr>
-                <w:rFonts w:ascii="Helvetica" w:hAnsi="Helvetica" w:eastAsia="Helvetica" w:cs="Helvetica"/>
-                <w:i w:val="false"/>
-                <w:b w:val="false"/>
-                <w:u w:val="none"/>
-                <w:strike w:val="false"/>
-                <w:sz w:val="22"/>
-                <w:szCs w:val="22"/>
-                <w:color w:val="000000"/>
-              </w:rPr>
-              <w:t xml:space="preserve">-10 [-21 – 0]</w:t>
+              <w:t xml:space="preserve">   92.0 (84.0 – 104.0)</w:t>
+            </w:r>
+          </w:p>
+        </w:tc>
+        <w:tc>
+          <w:tcPr>
+            <w:tcBorders>
+              <w:bottom w:val="none" w:sz="0" w:space="0" w:color="000000"/>
+              <w:top w:val="none" w:sz="0" w:space="0" w:color="000000"/>
+              <w:left w:val="none" w:sz="0" w:space="0" w:color="000000"/>
+              <w:right w:val="none" w:sz="0" w:space="0" w:color="000000"/>
+            </w:tcBorders>
+            <w:shd w:val="clear" w:color="auto" w:fill="FFFFFF"/>
+            <w:tcMar>
+              <w:top w:w="0" w:type="dxa"/>
+              <w:bottom w:w="0" w:type="dxa"/>
+              <w:left w:w="0" w:type="dxa"/>
+              <w:right w:w="0" w:type="dxa"/>
+            </w:tcMar>
+            <w:vAlign w:val="center"/>
+          </w:tcPr>
+          <w:p>
+            <w:pPr>
+              <w:jc w:val="center"/>
+              <w:pBdr>
+                <w:bottom w:val="none" w:sz="0" w:space="0" w:color="000000"/>
+                <w:top w:val="none" w:sz="0" w:space="0" w:color="000000"/>
+                <w:left w:val="none" w:sz="0" w:space="0" w:color="000000"/>
+                <w:right w:val="none" w:sz="0" w:space="0" w:color="000000"/>
+              </w:pBdr>
+              <w:spacing w:after="100" w:before="100" w:line="240"/>
+              <w:ind w:left="100" w:right="100" w:firstLine="0" w:firstLineChars="0"/>
+              <w:rPr>
+                <w:rFonts w:ascii="Helvetica" w:hAnsi="Helvetica" w:eastAsia="Helvetica" w:cs="Helvetica"/>
+                <w:i w:val="false"/>
+                <w:b w:val="false"/>
+                <w:u w:val="none"/>
+                <w:strike w:val="false"/>
+                <w:sz w:val="22"/>
+                <w:szCs w:val="22"/>
+                <w:color w:val="000000"/>
+              </w:rPr>
+            </w:pPr>
+            <w:r>
+              <w:rPr>
+                <w:rFonts w:ascii="Helvetica" w:hAnsi="Helvetica" w:eastAsia="Helvetica" w:cs="Helvetica"/>
+                <w:i w:val="false"/>
+                <w:b w:val="false"/>
+                <w:u w:val="none"/>
+                <w:strike w:val="false"/>
+                <w:sz w:val="22"/>
+                <w:szCs w:val="22"/>
+                <w:color w:val="000000"/>
+              </w:rPr>
+              <w:t xml:space="preserve"> 101.5 (91.8 – 116.2)</w:t>
+            </w:r>
+          </w:p>
+        </w:tc>
+        <w:tc>
+          <w:tcPr>
+            <w:tcBorders>
+              <w:bottom w:val="none" w:sz="0" w:space="0" w:color="000000"/>
+              <w:top w:val="none" w:sz="0" w:space="0" w:color="000000"/>
+              <w:left w:val="none" w:sz="0" w:space="0" w:color="000000"/>
+              <w:right w:val="none" w:sz="0" w:space="0" w:color="000000"/>
+            </w:tcBorders>
+            <w:shd w:val="clear" w:color="auto" w:fill="FFFFFF"/>
+            <w:tcMar>
+              <w:top w:w="0" w:type="dxa"/>
+              <w:bottom w:w="0" w:type="dxa"/>
+              <w:left w:w="0" w:type="dxa"/>
+              <w:right w:w="0" w:type="dxa"/>
+            </w:tcMar>
+            <w:vAlign w:val="center"/>
+          </w:tcPr>
+          <w:p>
+            <w:pPr>
+              <w:jc w:val="center"/>
+              <w:pBdr>
+                <w:bottom w:val="none" w:sz="0" w:space="0" w:color="000000"/>
+                <w:top w:val="none" w:sz="0" w:space="0" w:color="000000"/>
+                <w:left w:val="none" w:sz="0" w:space="0" w:color="000000"/>
+                <w:right w:val="none" w:sz="0" w:space="0" w:color="000000"/>
+              </w:pBdr>
+              <w:spacing w:after="100" w:before="100" w:line="240"/>
+              <w:ind w:left="100" w:right="100" w:firstLine="0" w:firstLineChars="0"/>
+              <w:rPr>
+                <w:rFonts w:ascii="Helvetica" w:hAnsi="Helvetica" w:eastAsia="Helvetica" w:cs="Helvetica"/>
+                <w:i w:val="false"/>
+                <w:b w:val="false"/>
+                <w:u w:val="none"/>
+                <w:strike w:val="false"/>
+                <w:sz w:val="22"/>
+                <w:szCs w:val="22"/>
+                <w:color w:val="000000"/>
+              </w:rPr>
+            </w:pPr>
+            <w:r>
+              <w:rPr>
+                <w:rFonts w:ascii="Helvetica" w:hAnsi="Helvetica" w:eastAsia="Helvetica" w:cs="Helvetica"/>
+                <w:i w:val="false"/>
+                <w:b w:val="false"/>
+                <w:u w:val="none"/>
+                <w:strike w:val="false"/>
+                <w:sz w:val="22"/>
+                <w:szCs w:val="22"/>
+                <w:color w:val="000000"/>
+              </w:rPr>
+              <w:t xml:space="preserve">-10 (-21 – 0)</w:t>
             </w:r>
           </w:p>
         </w:tc>
@@ -6553,115 +6553,115 @@
                 <w:szCs w:val="22"/>
                 <w:color w:val="000000"/>
               </w:rPr>
-              <w:t xml:space="preserve">   63.0 [59.5 – 68.0]</w:t>
-            </w:r>
-          </w:p>
-        </w:tc>
-        <w:tc>
-          <w:tcPr>
-            <w:tcBorders>
-              <w:bottom w:val="none" w:sz="0" w:space="0" w:color="000000"/>
-              <w:top w:val="none" w:sz="0" w:space="0" w:color="000000"/>
-              <w:left w:val="none" w:sz="0" w:space="0" w:color="000000"/>
-              <w:right w:val="none" w:sz="0" w:space="0" w:color="000000"/>
-            </w:tcBorders>
-            <w:shd w:val="clear" w:color="auto" w:fill="FFFFFF"/>
-            <w:tcMar>
-              <w:top w:w="0" w:type="dxa"/>
-              <w:bottom w:w="0" w:type="dxa"/>
-              <w:left w:w="0" w:type="dxa"/>
-              <w:right w:w="0" w:type="dxa"/>
-            </w:tcMar>
-            <w:vAlign w:val="center"/>
-          </w:tcPr>
-          <w:p>
-            <w:pPr>
-              <w:jc w:val="center"/>
-              <w:pBdr>
-                <w:bottom w:val="none" w:sz="0" w:space="0" w:color="000000"/>
-                <w:top w:val="none" w:sz="0" w:space="0" w:color="000000"/>
-                <w:left w:val="none" w:sz="0" w:space="0" w:color="000000"/>
-                <w:right w:val="none" w:sz="0" w:space="0" w:color="000000"/>
-              </w:pBdr>
-              <w:spacing w:after="100" w:before="100" w:line="240"/>
-              <w:ind w:left="100" w:right="100" w:firstLine="0" w:firstLineChars="0"/>
-              <w:rPr>
-                <w:rFonts w:ascii="Helvetica" w:hAnsi="Helvetica" w:eastAsia="Helvetica" w:cs="Helvetica"/>
-                <w:i w:val="false"/>
-                <w:b w:val="false"/>
-                <w:u w:val="none"/>
-                <w:strike w:val="false"/>
-                <w:sz w:val="22"/>
-                <w:szCs w:val="22"/>
-                <w:color w:val="000000"/>
-              </w:rPr>
-            </w:pPr>
-            <w:r>
-              <w:rPr>
-                <w:rFonts w:ascii="Helvetica" w:hAnsi="Helvetica" w:eastAsia="Helvetica" w:cs="Helvetica"/>
-                <w:i w:val="false"/>
-                <w:b w:val="false"/>
-                <w:u w:val="none"/>
-                <w:strike w:val="false"/>
-                <w:sz w:val="22"/>
-                <w:szCs w:val="22"/>
-                <w:color w:val="000000"/>
-              </w:rPr>
-              <w:t xml:space="preserve">  67.0 [56.0 – 72.2]</w:t>
-            </w:r>
-          </w:p>
-        </w:tc>
-        <w:tc>
-          <w:tcPr>
-            <w:tcBorders>
-              <w:bottom w:val="none" w:sz="0" w:space="0" w:color="000000"/>
-              <w:top w:val="none" w:sz="0" w:space="0" w:color="000000"/>
-              <w:left w:val="none" w:sz="0" w:space="0" w:color="000000"/>
-              <w:right w:val="none" w:sz="0" w:space="0" w:color="000000"/>
-            </w:tcBorders>
-            <w:shd w:val="clear" w:color="auto" w:fill="FFFFFF"/>
-            <w:tcMar>
-              <w:top w:w="0" w:type="dxa"/>
-              <w:bottom w:w="0" w:type="dxa"/>
-              <w:left w:w="0" w:type="dxa"/>
-              <w:right w:w="0" w:type="dxa"/>
-            </w:tcMar>
-            <w:vAlign w:val="center"/>
-          </w:tcPr>
-          <w:p>
-            <w:pPr>
-              <w:jc w:val="center"/>
-              <w:pBdr>
-                <w:bottom w:val="none" w:sz="0" w:space="0" w:color="000000"/>
-                <w:top w:val="none" w:sz="0" w:space="0" w:color="000000"/>
-                <w:left w:val="none" w:sz="0" w:space="0" w:color="000000"/>
-                <w:right w:val="none" w:sz="0" w:space="0" w:color="000000"/>
-              </w:pBdr>
-              <w:spacing w:after="100" w:before="100" w:line="240"/>
-              <w:ind w:left="100" w:right="100" w:firstLine="0" w:firstLineChars="0"/>
-              <w:rPr>
-                <w:rFonts w:ascii="Helvetica" w:hAnsi="Helvetica" w:eastAsia="Helvetica" w:cs="Helvetica"/>
-                <w:i w:val="false"/>
-                <w:b w:val="false"/>
-                <w:u w:val="none"/>
-                <w:strike w:val="false"/>
-                <w:sz w:val="22"/>
-                <w:szCs w:val="22"/>
-                <w:color w:val="000000"/>
-              </w:rPr>
-            </w:pPr>
-            <w:r>
-              <w:rPr>
-                <w:rFonts w:ascii="Helvetica" w:hAnsi="Helvetica" w:eastAsia="Helvetica" w:cs="Helvetica"/>
-                <w:i w:val="false"/>
-                <w:b w:val="false"/>
-                <w:u w:val="none"/>
-                <w:strike w:val="false"/>
-                <w:sz w:val="22"/>
-                <w:szCs w:val="22"/>
-                <w:color w:val="000000"/>
-              </w:rPr>
-              <w:t xml:space="preserve">-3 [-9 – 6]</w:t>
+              <w:t xml:space="preserve">   63.0 (59.5 – 68.0)</w:t>
+            </w:r>
+          </w:p>
+        </w:tc>
+        <w:tc>
+          <w:tcPr>
+            <w:tcBorders>
+              <w:bottom w:val="none" w:sz="0" w:space="0" w:color="000000"/>
+              <w:top w:val="none" w:sz="0" w:space="0" w:color="000000"/>
+              <w:left w:val="none" w:sz="0" w:space="0" w:color="000000"/>
+              <w:right w:val="none" w:sz="0" w:space="0" w:color="000000"/>
+            </w:tcBorders>
+            <w:shd w:val="clear" w:color="auto" w:fill="FFFFFF"/>
+            <w:tcMar>
+              <w:top w:w="0" w:type="dxa"/>
+              <w:bottom w:w="0" w:type="dxa"/>
+              <w:left w:w="0" w:type="dxa"/>
+              <w:right w:w="0" w:type="dxa"/>
+            </w:tcMar>
+            <w:vAlign w:val="center"/>
+          </w:tcPr>
+          <w:p>
+            <w:pPr>
+              <w:jc w:val="center"/>
+              <w:pBdr>
+                <w:bottom w:val="none" w:sz="0" w:space="0" w:color="000000"/>
+                <w:top w:val="none" w:sz="0" w:space="0" w:color="000000"/>
+                <w:left w:val="none" w:sz="0" w:space="0" w:color="000000"/>
+                <w:right w:val="none" w:sz="0" w:space="0" w:color="000000"/>
+              </w:pBdr>
+              <w:spacing w:after="100" w:before="100" w:line="240"/>
+              <w:ind w:left="100" w:right="100" w:firstLine="0" w:firstLineChars="0"/>
+              <w:rPr>
+                <w:rFonts w:ascii="Helvetica" w:hAnsi="Helvetica" w:eastAsia="Helvetica" w:cs="Helvetica"/>
+                <w:i w:val="false"/>
+                <w:b w:val="false"/>
+                <w:u w:val="none"/>
+                <w:strike w:val="false"/>
+                <w:sz w:val="22"/>
+                <w:szCs w:val="22"/>
+                <w:color w:val="000000"/>
+              </w:rPr>
+            </w:pPr>
+            <w:r>
+              <w:rPr>
+                <w:rFonts w:ascii="Helvetica" w:hAnsi="Helvetica" w:eastAsia="Helvetica" w:cs="Helvetica"/>
+                <w:i w:val="false"/>
+                <w:b w:val="false"/>
+                <w:u w:val="none"/>
+                <w:strike w:val="false"/>
+                <w:sz w:val="22"/>
+                <w:szCs w:val="22"/>
+                <w:color w:val="000000"/>
+              </w:rPr>
+              <w:t xml:space="preserve">  67.0 (56.0 – 72.2)</w:t>
+            </w:r>
+          </w:p>
+        </w:tc>
+        <w:tc>
+          <w:tcPr>
+            <w:tcBorders>
+              <w:bottom w:val="none" w:sz="0" w:space="0" w:color="000000"/>
+              <w:top w:val="none" w:sz="0" w:space="0" w:color="000000"/>
+              <w:left w:val="none" w:sz="0" w:space="0" w:color="000000"/>
+              <w:right w:val="none" w:sz="0" w:space="0" w:color="000000"/>
+            </w:tcBorders>
+            <w:shd w:val="clear" w:color="auto" w:fill="FFFFFF"/>
+            <w:tcMar>
+              <w:top w:w="0" w:type="dxa"/>
+              <w:bottom w:w="0" w:type="dxa"/>
+              <w:left w:w="0" w:type="dxa"/>
+              <w:right w:w="0" w:type="dxa"/>
+            </w:tcMar>
+            <w:vAlign w:val="center"/>
+          </w:tcPr>
+          <w:p>
+            <w:pPr>
+              <w:jc w:val="center"/>
+              <w:pBdr>
+                <w:bottom w:val="none" w:sz="0" w:space="0" w:color="000000"/>
+                <w:top w:val="none" w:sz="0" w:space="0" w:color="000000"/>
+                <w:left w:val="none" w:sz="0" w:space="0" w:color="000000"/>
+                <w:right w:val="none" w:sz="0" w:space="0" w:color="000000"/>
+              </w:pBdr>
+              <w:spacing w:after="100" w:before="100" w:line="240"/>
+              <w:ind w:left="100" w:right="100" w:firstLine="0" w:firstLineChars="0"/>
+              <w:rPr>
+                <w:rFonts w:ascii="Helvetica" w:hAnsi="Helvetica" w:eastAsia="Helvetica" w:cs="Helvetica"/>
+                <w:i w:val="false"/>
+                <w:b w:val="false"/>
+                <w:u w:val="none"/>
+                <w:strike w:val="false"/>
+                <w:sz w:val="22"/>
+                <w:szCs w:val="22"/>
+                <w:color w:val="000000"/>
+              </w:rPr>
+            </w:pPr>
+            <w:r>
+              <w:rPr>
+                <w:rFonts w:ascii="Helvetica" w:hAnsi="Helvetica" w:eastAsia="Helvetica" w:cs="Helvetica"/>
+                <w:i w:val="false"/>
+                <w:b w:val="false"/>
+                <w:u w:val="none"/>
+                <w:strike w:val="false"/>
+                <w:sz w:val="22"/>
+                <w:szCs w:val="22"/>
+                <w:color w:val="000000"/>
+              </w:rPr>
+              <w:t xml:space="preserve">-3 (-9 – 6)</w:t>
             </w:r>
           </w:p>
         </w:tc>
@@ -6829,115 +6829,115 @@
                 <w:szCs w:val="22"/>
                 <w:color w:val="000000"/>
               </w:rPr>
-              <w:t xml:space="preserve">   71.0 [68.0 – 78.5]</w:t>
-            </w:r>
-          </w:p>
-        </w:tc>
-        <w:tc>
-          <w:tcPr>
-            <w:tcBorders>
-              <w:bottom w:val="none" w:sz="0" w:space="0" w:color="000000"/>
-              <w:top w:val="none" w:sz="0" w:space="0" w:color="000000"/>
-              <w:left w:val="none" w:sz="0" w:space="0" w:color="000000"/>
-              <w:right w:val="none" w:sz="0" w:space="0" w:color="000000"/>
-            </w:tcBorders>
-            <w:shd w:val="clear" w:color="auto" w:fill="FFFFFF"/>
-            <w:tcMar>
-              <w:top w:w="0" w:type="dxa"/>
-              <w:bottom w:w="0" w:type="dxa"/>
-              <w:left w:w="0" w:type="dxa"/>
-              <w:right w:w="0" w:type="dxa"/>
-            </w:tcMar>
-            <w:vAlign w:val="center"/>
-          </w:tcPr>
-          <w:p>
-            <w:pPr>
-              <w:jc w:val="center"/>
-              <w:pBdr>
-                <w:bottom w:val="none" w:sz="0" w:space="0" w:color="000000"/>
-                <w:top w:val="none" w:sz="0" w:space="0" w:color="000000"/>
-                <w:left w:val="none" w:sz="0" w:space="0" w:color="000000"/>
-                <w:right w:val="none" w:sz="0" w:space="0" w:color="000000"/>
-              </w:pBdr>
-              <w:spacing w:after="100" w:before="100" w:line="240"/>
-              <w:ind w:left="100" w:right="100" w:firstLine="0" w:firstLineChars="0"/>
-              <w:rPr>
-                <w:rFonts w:ascii="Helvetica" w:hAnsi="Helvetica" w:eastAsia="Helvetica" w:cs="Helvetica"/>
-                <w:i w:val="false"/>
-                <w:b w:val="false"/>
-                <w:u w:val="none"/>
-                <w:strike w:val="false"/>
-                <w:sz w:val="22"/>
-                <w:szCs w:val="22"/>
-                <w:color w:val="000000"/>
-              </w:rPr>
-            </w:pPr>
-            <w:r>
-              <w:rPr>
-                <w:rFonts w:ascii="Helvetica" w:hAnsi="Helvetica" w:eastAsia="Helvetica" w:cs="Helvetica"/>
-                <w:i w:val="false"/>
-                <w:b w:val="false"/>
-                <w:u w:val="none"/>
-                <w:strike w:val="false"/>
-                <w:sz w:val="22"/>
-                <w:szCs w:val="22"/>
-                <w:color w:val="000000"/>
-              </w:rPr>
-              <w:t xml:space="preserve">  76.5 [68.8 – 87.0]</w:t>
-            </w:r>
-          </w:p>
-        </w:tc>
-        <w:tc>
-          <w:tcPr>
-            <w:tcBorders>
-              <w:bottom w:val="none" w:sz="0" w:space="0" w:color="000000"/>
-              <w:top w:val="none" w:sz="0" w:space="0" w:color="000000"/>
-              <w:left w:val="none" w:sz="0" w:space="0" w:color="000000"/>
-              <w:right w:val="none" w:sz="0" w:space="0" w:color="000000"/>
-            </w:tcBorders>
-            <w:shd w:val="clear" w:color="auto" w:fill="FFFFFF"/>
-            <w:tcMar>
-              <w:top w:w="0" w:type="dxa"/>
-              <w:bottom w:w="0" w:type="dxa"/>
-              <w:left w:w="0" w:type="dxa"/>
-              <w:right w:w="0" w:type="dxa"/>
-            </w:tcMar>
-            <w:vAlign w:val="center"/>
-          </w:tcPr>
-          <w:p>
-            <w:pPr>
-              <w:jc w:val="center"/>
-              <w:pBdr>
-                <w:bottom w:val="none" w:sz="0" w:space="0" w:color="000000"/>
-                <w:top w:val="none" w:sz="0" w:space="0" w:color="000000"/>
-                <w:left w:val="none" w:sz="0" w:space="0" w:color="000000"/>
-                <w:right w:val="none" w:sz="0" w:space="0" w:color="000000"/>
-              </w:pBdr>
-              <w:spacing w:after="100" w:before="100" w:line="240"/>
-              <w:ind w:left="100" w:right="100" w:firstLine="0" w:firstLineChars="0"/>
-              <w:rPr>
-                <w:rFonts w:ascii="Helvetica" w:hAnsi="Helvetica" w:eastAsia="Helvetica" w:cs="Helvetica"/>
-                <w:i w:val="false"/>
-                <w:b w:val="false"/>
-                <w:u w:val="none"/>
-                <w:strike w:val="false"/>
-                <w:sz w:val="22"/>
-                <w:szCs w:val="22"/>
-                <w:color w:val="000000"/>
-              </w:rPr>
-            </w:pPr>
-            <w:r>
-              <w:rPr>
-                <w:rFonts w:ascii="Helvetica" w:hAnsi="Helvetica" w:eastAsia="Helvetica" w:cs="Helvetica"/>
-                <w:i w:val="false"/>
-                <w:b w:val="false"/>
-                <w:u w:val="none"/>
-                <w:strike w:val="false"/>
-                <w:sz w:val="22"/>
-                <w:szCs w:val="22"/>
-                <w:color w:val="000000"/>
-              </w:rPr>
-              <w:t xml:space="preserve">-5 [-12 – 2]</w:t>
+              <w:t xml:space="preserve">   71.0 (68.0 – 78.5)</w:t>
+            </w:r>
+          </w:p>
+        </w:tc>
+        <w:tc>
+          <w:tcPr>
+            <w:tcBorders>
+              <w:bottom w:val="none" w:sz="0" w:space="0" w:color="000000"/>
+              <w:top w:val="none" w:sz="0" w:space="0" w:color="000000"/>
+              <w:left w:val="none" w:sz="0" w:space="0" w:color="000000"/>
+              <w:right w:val="none" w:sz="0" w:space="0" w:color="000000"/>
+            </w:tcBorders>
+            <w:shd w:val="clear" w:color="auto" w:fill="FFFFFF"/>
+            <w:tcMar>
+              <w:top w:w="0" w:type="dxa"/>
+              <w:bottom w:w="0" w:type="dxa"/>
+              <w:left w:w="0" w:type="dxa"/>
+              <w:right w:w="0" w:type="dxa"/>
+            </w:tcMar>
+            <w:vAlign w:val="center"/>
+          </w:tcPr>
+          <w:p>
+            <w:pPr>
+              <w:jc w:val="center"/>
+              <w:pBdr>
+                <w:bottom w:val="none" w:sz="0" w:space="0" w:color="000000"/>
+                <w:top w:val="none" w:sz="0" w:space="0" w:color="000000"/>
+                <w:left w:val="none" w:sz="0" w:space="0" w:color="000000"/>
+                <w:right w:val="none" w:sz="0" w:space="0" w:color="000000"/>
+              </w:pBdr>
+              <w:spacing w:after="100" w:before="100" w:line="240"/>
+              <w:ind w:left="100" w:right="100" w:firstLine="0" w:firstLineChars="0"/>
+              <w:rPr>
+                <w:rFonts w:ascii="Helvetica" w:hAnsi="Helvetica" w:eastAsia="Helvetica" w:cs="Helvetica"/>
+                <w:i w:val="false"/>
+                <w:b w:val="false"/>
+                <w:u w:val="none"/>
+                <w:strike w:val="false"/>
+                <w:sz w:val="22"/>
+                <w:szCs w:val="22"/>
+                <w:color w:val="000000"/>
+              </w:rPr>
+            </w:pPr>
+            <w:r>
+              <w:rPr>
+                <w:rFonts w:ascii="Helvetica" w:hAnsi="Helvetica" w:eastAsia="Helvetica" w:cs="Helvetica"/>
+                <w:i w:val="false"/>
+                <w:b w:val="false"/>
+                <w:u w:val="none"/>
+                <w:strike w:val="false"/>
+                <w:sz w:val="22"/>
+                <w:szCs w:val="22"/>
+                <w:color w:val="000000"/>
+              </w:rPr>
+              <w:t xml:space="preserve">  76.5 (68.8 – 87.0)</w:t>
+            </w:r>
+          </w:p>
+        </w:tc>
+        <w:tc>
+          <w:tcPr>
+            <w:tcBorders>
+              <w:bottom w:val="none" w:sz="0" w:space="0" w:color="000000"/>
+              <w:top w:val="none" w:sz="0" w:space="0" w:color="000000"/>
+              <w:left w:val="none" w:sz="0" w:space="0" w:color="000000"/>
+              <w:right w:val="none" w:sz="0" w:space="0" w:color="000000"/>
+            </w:tcBorders>
+            <w:shd w:val="clear" w:color="auto" w:fill="FFFFFF"/>
+            <w:tcMar>
+              <w:top w:w="0" w:type="dxa"/>
+              <w:bottom w:w="0" w:type="dxa"/>
+              <w:left w:w="0" w:type="dxa"/>
+              <w:right w:w="0" w:type="dxa"/>
+            </w:tcMar>
+            <w:vAlign w:val="center"/>
+          </w:tcPr>
+          <w:p>
+            <w:pPr>
+              <w:jc w:val="center"/>
+              <w:pBdr>
+                <w:bottom w:val="none" w:sz="0" w:space="0" w:color="000000"/>
+                <w:top w:val="none" w:sz="0" w:space="0" w:color="000000"/>
+                <w:left w:val="none" w:sz="0" w:space="0" w:color="000000"/>
+                <w:right w:val="none" w:sz="0" w:space="0" w:color="000000"/>
+              </w:pBdr>
+              <w:spacing w:after="100" w:before="100" w:line="240"/>
+              <w:ind w:left="100" w:right="100" w:firstLine="0" w:firstLineChars="0"/>
+              <w:rPr>
+                <w:rFonts w:ascii="Helvetica" w:hAnsi="Helvetica" w:eastAsia="Helvetica" w:cs="Helvetica"/>
+                <w:i w:val="false"/>
+                <w:b w:val="false"/>
+                <w:u w:val="none"/>
+                <w:strike w:val="false"/>
+                <w:sz w:val="22"/>
+                <w:szCs w:val="22"/>
+                <w:color w:val="000000"/>
+              </w:rPr>
+            </w:pPr>
+            <w:r>
+              <w:rPr>
+                <w:rFonts w:ascii="Helvetica" w:hAnsi="Helvetica" w:eastAsia="Helvetica" w:cs="Helvetica"/>
+                <w:i w:val="false"/>
+                <w:b w:val="false"/>
+                <w:u w:val="none"/>
+                <w:strike w:val="false"/>
+                <w:sz w:val="22"/>
+                <w:szCs w:val="22"/>
+                <w:color w:val="000000"/>
+              </w:rPr>
+              <w:t xml:space="preserve">-5 (-12 – 2)</w:t>
             </w:r>
           </w:p>
         </w:tc>
@@ -7105,115 +7105,115 @@
                 <w:szCs w:val="22"/>
                 <w:color w:val="000000"/>
               </w:rPr>
-              <w:t xml:space="preserve">   96.0 [86.0 – 125.5]</w:t>
-            </w:r>
-          </w:p>
-        </w:tc>
-        <w:tc>
-          <w:tcPr>
-            <w:tcBorders>
-              <w:bottom w:val="none" w:sz="0" w:space="0" w:color="000000"/>
-              <w:top w:val="none" w:sz="0" w:space="0" w:color="000000"/>
-              <w:left w:val="none" w:sz="0" w:space="0" w:color="000000"/>
-              <w:right w:val="none" w:sz="0" w:space="0" w:color="000000"/>
-            </w:tcBorders>
-            <w:shd w:val="clear" w:color="auto" w:fill="FFFFFF"/>
-            <w:tcMar>
-              <w:top w:w="0" w:type="dxa"/>
-              <w:bottom w:w="0" w:type="dxa"/>
-              <w:left w:w="0" w:type="dxa"/>
-              <w:right w:w="0" w:type="dxa"/>
-            </w:tcMar>
-            <w:vAlign w:val="center"/>
-          </w:tcPr>
-          <w:p>
-            <w:pPr>
-              <w:jc w:val="center"/>
-              <w:pBdr>
-                <w:bottom w:val="none" w:sz="0" w:space="0" w:color="000000"/>
-                <w:top w:val="none" w:sz="0" w:space="0" w:color="000000"/>
-                <w:left w:val="none" w:sz="0" w:space="0" w:color="000000"/>
-                <w:right w:val="none" w:sz="0" w:space="0" w:color="000000"/>
-              </w:pBdr>
-              <w:spacing w:after="100" w:before="100" w:line="240"/>
-              <w:ind w:left="100" w:right="100" w:firstLine="0" w:firstLineChars="0"/>
-              <w:rPr>
-                <w:rFonts w:ascii="Helvetica" w:hAnsi="Helvetica" w:eastAsia="Helvetica" w:cs="Helvetica"/>
-                <w:i w:val="false"/>
-                <w:b w:val="false"/>
-                <w:u w:val="none"/>
-                <w:strike w:val="false"/>
-                <w:sz w:val="22"/>
-                <w:szCs w:val="22"/>
-                <w:color w:val="000000"/>
-              </w:rPr>
-            </w:pPr>
-            <w:r>
-              <w:rPr>
-                <w:rFonts w:ascii="Helvetica" w:hAnsi="Helvetica" w:eastAsia="Helvetica" w:cs="Helvetica"/>
-                <w:i w:val="false"/>
-                <w:b w:val="false"/>
-                <w:u w:val="none"/>
-                <w:strike w:val="false"/>
-                <w:sz w:val="22"/>
-                <w:szCs w:val="22"/>
-                <w:color w:val="000000"/>
-              </w:rPr>
-              <w:t xml:space="preserve">  95.5 [84.0 – 103.5]</w:t>
-            </w:r>
-          </w:p>
-        </w:tc>
-        <w:tc>
-          <w:tcPr>
-            <w:tcBorders>
-              <w:bottom w:val="none" w:sz="0" w:space="0" w:color="000000"/>
-              <w:top w:val="none" w:sz="0" w:space="0" w:color="000000"/>
-              <w:left w:val="none" w:sz="0" w:space="0" w:color="000000"/>
-              <w:right w:val="none" w:sz="0" w:space="0" w:color="000000"/>
-            </w:tcBorders>
-            <w:shd w:val="clear" w:color="auto" w:fill="FFFFFF"/>
-            <w:tcMar>
-              <w:top w:w="0" w:type="dxa"/>
-              <w:bottom w:w="0" w:type="dxa"/>
-              <w:left w:w="0" w:type="dxa"/>
-              <w:right w:w="0" w:type="dxa"/>
-            </w:tcMar>
-            <w:vAlign w:val="center"/>
-          </w:tcPr>
-          <w:p>
-            <w:pPr>
-              <w:jc w:val="center"/>
-              <w:pBdr>
-                <w:bottom w:val="none" w:sz="0" w:space="0" w:color="000000"/>
-                <w:top w:val="none" w:sz="0" w:space="0" w:color="000000"/>
-                <w:left w:val="none" w:sz="0" w:space="0" w:color="000000"/>
-                <w:right w:val="none" w:sz="0" w:space="0" w:color="000000"/>
-              </w:pBdr>
-              <w:spacing w:after="100" w:before="100" w:line="240"/>
-              <w:ind w:left="100" w:right="100" w:firstLine="0" w:firstLineChars="0"/>
-              <w:rPr>
-                <w:rFonts w:ascii="Helvetica" w:hAnsi="Helvetica" w:eastAsia="Helvetica" w:cs="Helvetica"/>
-                <w:i w:val="false"/>
-                <w:b w:val="false"/>
-                <w:u w:val="none"/>
-                <w:strike w:val="false"/>
-                <w:sz w:val="22"/>
-                <w:szCs w:val="22"/>
-                <w:color w:val="000000"/>
-              </w:rPr>
-            </w:pPr>
-            <w:r>
-              <w:rPr>
-                <w:rFonts w:ascii="Helvetica" w:hAnsi="Helvetica" w:eastAsia="Helvetica" w:cs="Helvetica"/>
-                <w:i w:val="false"/>
-                <w:b w:val="false"/>
-                <w:u w:val="none"/>
-                <w:strike w:val="false"/>
-                <w:sz w:val="22"/>
-                <w:szCs w:val="22"/>
-                <w:color w:val="000000"/>
-              </w:rPr>
-              <w:t xml:space="preserve">4 [-7 – 21]</w:t>
+              <w:t xml:space="preserve">   96.0 (86.0 – 125.5)</w:t>
+            </w:r>
+          </w:p>
+        </w:tc>
+        <w:tc>
+          <w:tcPr>
+            <w:tcBorders>
+              <w:bottom w:val="none" w:sz="0" w:space="0" w:color="000000"/>
+              <w:top w:val="none" w:sz="0" w:space="0" w:color="000000"/>
+              <w:left w:val="none" w:sz="0" w:space="0" w:color="000000"/>
+              <w:right w:val="none" w:sz="0" w:space="0" w:color="000000"/>
+            </w:tcBorders>
+            <w:shd w:val="clear" w:color="auto" w:fill="FFFFFF"/>
+            <w:tcMar>
+              <w:top w:w="0" w:type="dxa"/>
+              <w:bottom w:w="0" w:type="dxa"/>
+              <w:left w:w="0" w:type="dxa"/>
+              <w:right w:w="0" w:type="dxa"/>
+            </w:tcMar>
+            <w:vAlign w:val="center"/>
+          </w:tcPr>
+          <w:p>
+            <w:pPr>
+              <w:jc w:val="center"/>
+              <w:pBdr>
+                <w:bottom w:val="none" w:sz="0" w:space="0" w:color="000000"/>
+                <w:top w:val="none" w:sz="0" w:space="0" w:color="000000"/>
+                <w:left w:val="none" w:sz="0" w:space="0" w:color="000000"/>
+                <w:right w:val="none" w:sz="0" w:space="0" w:color="000000"/>
+              </w:pBdr>
+              <w:spacing w:after="100" w:before="100" w:line="240"/>
+              <w:ind w:left="100" w:right="100" w:firstLine="0" w:firstLineChars="0"/>
+              <w:rPr>
+                <w:rFonts w:ascii="Helvetica" w:hAnsi="Helvetica" w:eastAsia="Helvetica" w:cs="Helvetica"/>
+                <w:i w:val="false"/>
+                <w:b w:val="false"/>
+                <w:u w:val="none"/>
+                <w:strike w:val="false"/>
+                <w:sz w:val="22"/>
+                <w:szCs w:val="22"/>
+                <w:color w:val="000000"/>
+              </w:rPr>
+            </w:pPr>
+            <w:r>
+              <w:rPr>
+                <w:rFonts w:ascii="Helvetica" w:hAnsi="Helvetica" w:eastAsia="Helvetica" w:cs="Helvetica"/>
+                <w:i w:val="false"/>
+                <w:b w:val="false"/>
+                <w:u w:val="none"/>
+                <w:strike w:val="false"/>
+                <w:sz w:val="22"/>
+                <w:szCs w:val="22"/>
+                <w:color w:val="000000"/>
+              </w:rPr>
+              <w:t xml:space="preserve">  95.5 (84.0 – 103.5)</w:t>
+            </w:r>
+          </w:p>
+        </w:tc>
+        <w:tc>
+          <w:tcPr>
+            <w:tcBorders>
+              <w:bottom w:val="none" w:sz="0" w:space="0" w:color="000000"/>
+              <w:top w:val="none" w:sz="0" w:space="0" w:color="000000"/>
+              <w:left w:val="none" w:sz="0" w:space="0" w:color="000000"/>
+              <w:right w:val="none" w:sz="0" w:space="0" w:color="000000"/>
+            </w:tcBorders>
+            <w:shd w:val="clear" w:color="auto" w:fill="FFFFFF"/>
+            <w:tcMar>
+              <w:top w:w="0" w:type="dxa"/>
+              <w:bottom w:w="0" w:type="dxa"/>
+              <w:left w:w="0" w:type="dxa"/>
+              <w:right w:w="0" w:type="dxa"/>
+            </w:tcMar>
+            <w:vAlign w:val="center"/>
+          </w:tcPr>
+          <w:p>
+            <w:pPr>
+              <w:jc w:val="center"/>
+              <w:pBdr>
+                <w:bottom w:val="none" w:sz="0" w:space="0" w:color="000000"/>
+                <w:top w:val="none" w:sz="0" w:space="0" w:color="000000"/>
+                <w:left w:val="none" w:sz="0" w:space="0" w:color="000000"/>
+                <w:right w:val="none" w:sz="0" w:space="0" w:color="000000"/>
+              </w:pBdr>
+              <w:spacing w:after="100" w:before="100" w:line="240"/>
+              <w:ind w:left="100" w:right="100" w:firstLine="0" w:firstLineChars="0"/>
+              <w:rPr>
+                <w:rFonts w:ascii="Helvetica" w:hAnsi="Helvetica" w:eastAsia="Helvetica" w:cs="Helvetica"/>
+                <w:i w:val="false"/>
+                <w:b w:val="false"/>
+                <w:u w:val="none"/>
+                <w:strike w:val="false"/>
+                <w:sz w:val="22"/>
+                <w:szCs w:val="22"/>
+                <w:color w:val="000000"/>
+              </w:rPr>
+            </w:pPr>
+            <w:r>
+              <w:rPr>
+                <w:rFonts w:ascii="Helvetica" w:hAnsi="Helvetica" w:eastAsia="Helvetica" w:cs="Helvetica"/>
+                <w:i w:val="false"/>
+                <w:b w:val="false"/>
+                <w:u w:val="none"/>
+                <w:strike w:val="false"/>
+                <w:sz w:val="22"/>
+                <w:szCs w:val="22"/>
+                <w:color w:val="000000"/>
+              </w:rPr>
+              <w:t xml:space="preserve">4 (-7 – 21)</w:t>
             </w:r>
           </w:p>
         </w:tc>
@@ -7381,115 +7381,115 @@
                 <w:szCs w:val="22"/>
                 <w:color w:val="000000"/>
               </w:rPr>
-              <w:t xml:space="preserve">   17.5 [13.8 – 25.2]</w:t>
-            </w:r>
-          </w:p>
-        </w:tc>
-        <w:tc>
-          <w:tcPr>
-            <w:tcBorders>
-              <w:bottom w:val="none" w:sz="0" w:space="0" w:color="000000"/>
-              <w:top w:val="none" w:sz="0" w:space="0" w:color="000000"/>
-              <w:left w:val="none" w:sz="0" w:space="0" w:color="000000"/>
-              <w:right w:val="none" w:sz="0" w:space="0" w:color="000000"/>
-            </w:tcBorders>
-            <w:shd w:val="clear" w:color="auto" w:fill="FFFFFF"/>
-            <w:tcMar>
-              <w:top w:w="0" w:type="dxa"/>
-              <w:bottom w:w="0" w:type="dxa"/>
-              <w:left w:w="0" w:type="dxa"/>
-              <w:right w:w="0" w:type="dxa"/>
-            </w:tcMar>
-            <w:vAlign w:val="center"/>
-          </w:tcPr>
-          <w:p>
-            <w:pPr>
-              <w:jc w:val="center"/>
-              <w:pBdr>
-                <w:bottom w:val="none" w:sz="0" w:space="0" w:color="000000"/>
-                <w:top w:val="none" w:sz="0" w:space="0" w:color="000000"/>
-                <w:left w:val="none" w:sz="0" w:space="0" w:color="000000"/>
-                <w:right w:val="none" w:sz="0" w:space="0" w:color="000000"/>
-              </w:pBdr>
-              <w:spacing w:after="100" w:before="100" w:line="240"/>
-              <w:ind w:left="100" w:right="100" w:firstLine="0" w:firstLineChars="0"/>
-              <w:rPr>
-                <w:rFonts w:ascii="Helvetica" w:hAnsi="Helvetica" w:eastAsia="Helvetica" w:cs="Helvetica"/>
-                <w:i w:val="false"/>
-                <w:b w:val="false"/>
-                <w:u w:val="none"/>
-                <w:strike w:val="false"/>
-                <w:sz w:val="22"/>
-                <w:szCs w:val="22"/>
-                <w:color w:val="000000"/>
-              </w:rPr>
-            </w:pPr>
-            <w:r>
-              <w:rPr>
-                <w:rFonts w:ascii="Helvetica" w:hAnsi="Helvetica" w:eastAsia="Helvetica" w:cs="Helvetica"/>
-                <w:i w:val="false"/>
-                <w:b w:val="false"/>
-                <w:u w:val="none"/>
-                <w:strike w:val="false"/>
-                <w:sz w:val="22"/>
-                <w:szCs w:val="22"/>
-                <w:color w:val="000000"/>
-              </w:rPr>
-              <w:t xml:space="preserve">  20.0 [15.0 – 20.0]</w:t>
-            </w:r>
-          </w:p>
-        </w:tc>
-        <w:tc>
-          <w:tcPr>
-            <w:tcBorders>
-              <w:bottom w:val="none" w:sz="0" w:space="0" w:color="000000"/>
-              <w:top w:val="none" w:sz="0" w:space="0" w:color="000000"/>
-              <w:left w:val="none" w:sz="0" w:space="0" w:color="000000"/>
-              <w:right w:val="none" w:sz="0" w:space="0" w:color="000000"/>
-            </w:tcBorders>
-            <w:shd w:val="clear" w:color="auto" w:fill="FFFFFF"/>
-            <w:tcMar>
-              <w:top w:w="0" w:type="dxa"/>
-              <w:bottom w:w="0" w:type="dxa"/>
-              <w:left w:w="0" w:type="dxa"/>
-              <w:right w:w="0" w:type="dxa"/>
-            </w:tcMar>
-            <w:vAlign w:val="center"/>
-          </w:tcPr>
-          <w:p>
-            <w:pPr>
-              <w:jc w:val="center"/>
-              <w:pBdr>
-                <w:bottom w:val="none" w:sz="0" w:space="0" w:color="000000"/>
-                <w:top w:val="none" w:sz="0" w:space="0" w:color="000000"/>
-                <w:left w:val="none" w:sz="0" w:space="0" w:color="000000"/>
-                <w:right w:val="none" w:sz="0" w:space="0" w:color="000000"/>
-              </w:pBdr>
-              <w:spacing w:after="100" w:before="100" w:line="240"/>
-              <w:ind w:left="100" w:right="100" w:firstLine="0" w:firstLineChars="0"/>
-              <w:rPr>
-                <w:rFonts w:ascii="Helvetica" w:hAnsi="Helvetica" w:eastAsia="Helvetica" w:cs="Helvetica"/>
-                <w:i w:val="false"/>
-                <w:b w:val="false"/>
-                <w:u w:val="none"/>
-                <w:strike w:val="false"/>
-                <w:sz w:val="22"/>
-                <w:szCs w:val="22"/>
-                <w:color w:val="000000"/>
-              </w:rPr>
-            </w:pPr>
-            <w:r>
-              <w:rPr>
-                <w:rFonts w:ascii="Helvetica" w:hAnsi="Helvetica" w:eastAsia="Helvetica" w:cs="Helvetica"/>
-                <w:i w:val="false"/>
-                <w:b w:val="false"/>
-                <w:u w:val="none"/>
-                <w:strike w:val="false"/>
-                <w:sz w:val="22"/>
-                <w:szCs w:val="22"/>
-                <w:color w:val="000000"/>
-              </w:rPr>
-              <w:t xml:space="preserve">-0 [-5 – 5]</w:t>
+              <w:t xml:space="preserve">   17.5 (13.8 – 25.2)</w:t>
+            </w:r>
+          </w:p>
+        </w:tc>
+        <w:tc>
+          <w:tcPr>
+            <w:tcBorders>
+              <w:bottom w:val="none" w:sz="0" w:space="0" w:color="000000"/>
+              <w:top w:val="none" w:sz="0" w:space="0" w:color="000000"/>
+              <w:left w:val="none" w:sz="0" w:space="0" w:color="000000"/>
+              <w:right w:val="none" w:sz="0" w:space="0" w:color="000000"/>
+            </w:tcBorders>
+            <w:shd w:val="clear" w:color="auto" w:fill="FFFFFF"/>
+            <w:tcMar>
+              <w:top w:w="0" w:type="dxa"/>
+              <w:bottom w:w="0" w:type="dxa"/>
+              <w:left w:w="0" w:type="dxa"/>
+              <w:right w:w="0" w:type="dxa"/>
+            </w:tcMar>
+            <w:vAlign w:val="center"/>
+          </w:tcPr>
+          <w:p>
+            <w:pPr>
+              <w:jc w:val="center"/>
+              <w:pBdr>
+                <w:bottom w:val="none" w:sz="0" w:space="0" w:color="000000"/>
+                <w:top w:val="none" w:sz="0" w:space="0" w:color="000000"/>
+                <w:left w:val="none" w:sz="0" w:space="0" w:color="000000"/>
+                <w:right w:val="none" w:sz="0" w:space="0" w:color="000000"/>
+              </w:pBdr>
+              <w:spacing w:after="100" w:before="100" w:line="240"/>
+              <w:ind w:left="100" w:right="100" w:firstLine="0" w:firstLineChars="0"/>
+              <w:rPr>
+                <w:rFonts w:ascii="Helvetica" w:hAnsi="Helvetica" w:eastAsia="Helvetica" w:cs="Helvetica"/>
+                <w:i w:val="false"/>
+                <w:b w:val="false"/>
+                <w:u w:val="none"/>
+                <w:strike w:val="false"/>
+                <w:sz w:val="22"/>
+                <w:szCs w:val="22"/>
+                <w:color w:val="000000"/>
+              </w:rPr>
+            </w:pPr>
+            <w:r>
+              <w:rPr>
+                <w:rFonts w:ascii="Helvetica" w:hAnsi="Helvetica" w:eastAsia="Helvetica" w:cs="Helvetica"/>
+                <w:i w:val="false"/>
+                <w:b w:val="false"/>
+                <w:u w:val="none"/>
+                <w:strike w:val="false"/>
+                <w:sz w:val="22"/>
+                <w:szCs w:val="22"/>
+                <w:color w:val="000000"/>
+              </w:rPr>
+              <w:t xml:space="preserve">  20.0 (15.0 – 20.0)</w:t>
+            </w:r>
+          </w:p>
+        </w:tc>
+        <w:tc>
+          <w:tcPr>
+            <w:tcBorders>
+              <w:bottom w:val="none" w:sz="0" w:space="0" w:color="000000"/>
+              <w:top w:val="none" w:sz="0" w:space="0" w:color="000000"/>
+              <w:left w:val="none" w:sz="0" w:space="0" w:color="000000"/>
+              <w:right w:val="none" w:sz="0" w:space="0" w:color="000000"/>
+            </w:tcBorders>
+            <w:shd w:val="clear" w:color="auto" w:fill="FFFFFF"/>
+            <w:tcMar>
+              <w:top w:w="0" w:type="dxa"/>
+              <w:bottom w:w="0" w:type="dxa"/>
+              <w:left w:w="0" w:type="dxa"/>
+              <w:right w:w="0" w:type="dxa"/>
+            </w:tcMar>
+            <w:vAlign w:val="center"/>
+          </w:tcPr>
+          <w:p>
+            <w:pPr>
+              <w:jc w:val="center"/>
+              <w:pBdr>
+                <w:bottom w:val="none" w:sz="0" w:space="0" w:color="000000"/>
+                <w:top w:val="none" w:sz="0" w:space="0" w:color="000000"/>
+                <w:left w:val="none" w:sz="0" w:space="0" w:color="000000"/>
+                <w:right w:val="none" w:sz="0" w:space="0" w:color="000000"/>
+              </w:pBdr>
+              <w:spacing w:after="100" w:before="100" w:line="240"/>
+              <w:ind w:left="100" w:right="100" w:firstLine="0" w:firstLineChars="0"/>
+              <w:rPr>
+                <w:rFonts w:ascii="Helvetica" w:hAnsi="Helvetica" w:eastAsia="Helvetica" w:cs="Helvetica"/>
+                <w:i w:val="false"/>
+                <w:b w:val="false"/>
+                <w:u w:val="none"/>
+                <w:strike w:val="false"/>
+                <w:sz w:val="22"/>
+                <w:szCs w:val="22"/>
+                <w:color w:val="000000"/>
+              </w:rPr>
+            </w:pPr>
+            <w:r>
+              <w:rPr>
+                <w:rFonts w:ascii="Helvetica" w:hAnsi="Helvetica" w:eastAsia="Helvetica" w:cs="Helvetica"/>
+                <w:i w:val="false"/>
+                <w:b w:val="false"/>
+                <w:u w:val="none"/>
+                <w:strike w:val="false"/>
+                <w:sz w:val="22"/>
+                <w:szCs w:val="22"/>
+                <w:color w:val="000000"/>
+              </w:rPr>
+              <w:t xml:space="preserve">-0 (-5 – 5)</w:t>
             </w:r>
           </w:p>
         </w:tc>
@@ -7657,115 +7657,115 @@
                 <w:szCs w:val="22"/>
                 <w:color w:val="000000"/>
               </w:rPr>
-              <w:t xml:space="preserve">    8.0 [5.5 – 9.0]</w:t>
-            </w:r>
-          </w:p>
-        </w:tc>
-        <w:tc>
-          <w:tcPr>
-            <w:tcBorders>
-              <w:bottom w:val="none" w:sz="0" w:space="0" w:color="000000"/>
-              <w:top w:val="none" w:sz="0" w:space="0" w:color="000000"/>
-              <w:left w:val="none" w:sz="0" w:space="0" w:color="000000"/>
-              <w:right w:val="none" w:sz="0" w:space="0" w:color="000000"/>
-            </w:tcBorders>
-            <w:shd w:val="clear" w:color="auto" w:fill="FFFFFF"/>
-            <w:tcMar>
-              <w:top w:w="0" w:type="dxa"/>
-              <w:bottom w:w="0" w:type="dxa"/>
-              <w:left w:w="0" w:type="dxa"/>
-              <w:right w:w="0" w:type="dxa"/>
-            </w:tcMar>
-            <w:vAlign w:val="center"/>
-          </w:tcPr>
-          <w:p>
-            <w:pPr>
-              <w:jc w:val="center"/>
-              <w:pBdr>
-                <w:bottom w:val="none" w:sz="0" w:space="0" w:color="000000"/>
-                <w:top w:val="none" w:sz="0" w:space="0" w:color="000000"/>
-                <w:left w:val="none" w:sz="0" w:space="0" w:color="000000"/>
-                <w:right w:val="none" w:sz="0" w:space="0" w:color="000000"/>
-              </w:pBdr>
-              <w:spacing w:after="100" w:before="100" w:line="240"/>
-              <w:ind w:left="100" w:right="100" w:firstLine="0" w:firstLineChars="0"/>
-              <w:rPr>
-                <w:rFonts w:ascii="Helvetica" w:hAnsi="Helvetica" w:eastAsia="Helvetica" w:cs="Helvetica"/>
-                <w:i w:val="false"/>
-                <w:b w:val="false"/>
-                <w:u w:val="none"/>
-                <w:strike w:val="false"/>
-                <w:sz w:val="22"/>
-                <w:szCs w:val="22"/>
-                <w:color w:val="000000"/>
-              </w:rPr>
-            </w:pPr>
-            <w:r>
-              <w:rPr>
-                <w:rFonts w:ascii="Helvetica" w:hAnsi="Helvetica" w:eastAsia="Helvetica" w:cs="Helvetica"/>
-                <w:i w:val="false"/>
-                <w:b w:val="false"/>
-                <w:u w:val="none"/>
-                <w:strike w:val="false"/>
-                <w:sz w:val="22"/>
-                <w:szCs w:val="22"/>
-                <w:color w:val="000000"/>
-              </w:rPr>
-              <w:t xml:space="preserve">   7.0 [6.0 – 8.0]</w:t>
-            </w:r>
-          </w:p>
-        </w:tc>
-        <w:tc>
-          <w:tcPr>
-            <w:tcBorders>
-              <w:bottom w:val="none" w:sz="0" w:space="0" w:color="000000"/>
-              <w:top w:val="none" w:sz="0" w:space="0" w:color="000000"/>
-              <w:left w:val="none" w:sz="0" w:space="0" w:color="000000"/>
-              <w:right w:val="none" w:sz="0" w:space="0" w:color="000000"/>
-            </w:tcBorders>
-            <w:shd w:val="clear" w:color="auto" w:fill="FFFFFF"/>
-            <w:tcMar>
-              <w:top w:w="0" w:type="dxa"/>
-              <w:bottom w:w="0" w:type="dxa"/>
-              <w:left w:w="0" w:type="dxa"/>
-              <w:right w:w="0" w:type="dxa"/>
-            </w:tcMar>
-            <w:vAlign w:val="center"/>
-          </w:tcPr>
-          <w:p>
-            <w:pPr>
-              <w:jc w:val="center"/>
-              <w:pBdr>
-                <w:bottom w:val="none" w:sz="0" w:space="0" w:color="000000"/>
-                <w:top w:val="none" w:sz="0" w:space="0" w:color="000000"/>
-                <w:left w:val="none" w:sz="0" w:space="0" w:color="000000"/>
-                <w:right w:val="none" w:sz="0" w:space="0" w:color="000000"/>
-              </w:pBdr>
-              <w:spacing w:after="100" w:before="100" w:line="240"/>
-              <w:ind w:left="100" w:right="100" w:firstLine="0" w:firstLineChars="0"/>
-              <w:rPr>
-                <w:rFonts w:ascii="Helvetica" w:hAnsi="Helvetica" w:eastAsia="Helvetica" w:cs="Helvetica"/>
-                <w:i w:val="false"/>
-                <w:b w:val="false"/>
-                <w:u w:val="none"/>
-                <w:strike w:val="false"/>
-                <w:sz w:val="22"/>
-                <w:szCs w:val="22"/>
-                <w:color w:val="000000"/>
-              </w:rPr>
-            </w:pPr>
-            <w:r>
-              <w:rPr>
-                <w:rFonts w:ascii="Helvetica" w:hAnsi="Helvetica" w:eastAsia="Helvetica" w:cs="Helvetica"/>
-                <w:i w:val="false"/>
-                <w:b w:val="false"/>
-                <w:u w:val="none"/>
-                <w:strike w:val="false"/>
-                <w:sz w:val="22"/>
-                <w:szCs w:val="22"/>
-                <w:color w:val="000000"/>
-              </w:rPr>
-              <w:t xml:space="preserve">0 [-2 – 2]</w:t>
+              <w:t xml:space="preserve">    8.0 (5.5 – 9.0)</w:t>
+            </w:r>
+          </w:p>
+        </w:tc>
+        <w:tc>
+          <w:tcPr>
+            <w:tcBorders>
+              <w:bottom w:val="none" w:sz="0" w:space="0" w:color="000000"/>
+              <w:top w:val="none" w:sz="0" w:space="0" w:color="000000"/>
+              <w:left w:val="none" w:sz="0" w:space="0" w:color="000000"/>
+              <w:right w:val="none" w:sz="0" w:space="0" w:color="000000"/>
+            </w:tcBorders>
+            <w:shd w:val="clear" w:color="auto" w:fill="FFFFFF"/>
+            <w:tcMar>
+              <w:top w:w="0" w:type="dxa"/>
+              <w:bottom w:w="0" w:type="dxa"/>
+              <w:left w:w="0" w:type="dxa"/>
+              <w:right w:w="0" w:type="dxa"/>
+            </w:tcMar>
+            <w:vAlign w:val="center"/>
+          </w:tcPr>
+          <w:p>
+            <w:pPr>
+              <w:jc w:val="center"/>
+              <w:pBdr>
+                <w:bottom w:val="none" w:sz="0" w:space="0" w:color="000000"/>
+                <w:top w:val="none" w:sz="0" w:space="0" w:color="000000"/>
+                <w:left w:val="none" w:sz="0" w:space="0" w:color="000000"/>
+                <w:right w:val="none" w:sz="0" w:space="0" w:color="000000"/>
+              </w:pBdr>
+              <w:spacing w:after="100" w:before="100" w:line="240"/>
+              <w:ind w:left="100" w:right="100" w:firstLine="0" w:firstLineChars="0"/>
+              <w:rPr>
+                <w:rFonts w:ascii="Helvetica" w:hAnsi="Helvetica" w:eastAsia="Helvetica" w:cs="Helvetica"/>
+                <w:i w:val="false"/>
+                <w:b w:val="false"/>
+                <w:u w:val="none"/>
+                <w:strike w:val="false"/>
+                <w:sz w:val="22"/>
+                <w:szCs w:val="22"/>
+                <w:color w:val="000000"/>
+              </w:rPr>
+            </w:pPr>
+            <w:r>
+              <w:rPr>
+                <w:rFonts w:ascii="Helvetica" w:hAnsi="Helvetica" w:eastAsia="Helvetica" w:cs="Helvetica"/>
+                <w:i w:val="false"/>
+                <w:b w:val="false"/>
+                <w:u w:val="none"/>
+                <w:strike w:val="false"/>
+                <w:sz w:val="22"/>
+                <w:szCs w:val="22"/>
+                <w:color w:val="000000"/>
+              </w:rPr>
+              <w:t xml:space="preserve">   7.0 (6.0 – 8.0)</w:t>
+            </w:r>
+          </w:p>
+        </w:tc>
+        <w:tc>
+          <w:tcPr>
+            <w:tcBorders>
+              <w:bottom w:val="none" w:sz="0" w:space="0" w:color="000000"/>
+              <w:top w:val="none" w:sz="0" w:space="0" w:color="000000"/>
+              <w:left w:val="none" w:sz="0" w:space="0" w:color="000000"/>
+              <w:right w:val="none" w:sz="0" w:space="0" w:color="000000"/>
+            </w:tcBorders>
+            <w:shd w:val="clear" w:color="auto" w:fill="FFFFFF"/>
+            <w:tcMar>
+              <w:top w:w="0" w:type="dxa"/>
+              <w:bottom w:w="0" w:type="dxa"/>
+              <w:left w:w="0" w:type="dxa"/>
+              <w:right w:w="0" w:type="dxa"/>
+            </w:tcMar>
+            <w:vAlign w:val="center"/>
+          </w:tcPr>
+          <w:p>
+            <w:pPr>
+              <w:jc w:val="center"/>
+              <w:pBdr>
+                <w:bottom w:val="none" w:sz="0" w:space="0" w:color="000000"/>
+                <w:top w:val="none" w:sz="0" w:space="0" w:color="000000"/>
+                <w:left w:val="none" w:sz="0" w:space="0" w:color="000000"/>
+                <w:right w:val="none" w:sz="0" w:space="0" w:color="000000"/>
+              </w:pBdr>
+              <w:spacing w:after="100" w:before="100" w:line="240"/>
+              <w:ind w:left="100" w:right="100" w:firstLine="0" w:firstLineChars="0"/>
+              <w:rPr>
+                <w:rFonts w:ascii="Helvetica" w:hAnsi="Helvetica" w:eastAsia="Helvetica" w:cs="Helvetica"/>
+                <w:i w:val="false"/>
+                <w:b w:val="false"/>
+                <w:u w:val="none"/>
+                <w:strike w:val="false"/>
+                <w:sz w:val="22"/>
+                <w:szCs w:val="22"/>
+                <w:color w:val="000000"/>
+              </w:rPr>
+            </w:pPr>
+            <w:r>
+              <w:rPr>
+                <w:rFonts w:ascii="Helvetica" w:hAnsi="Helvetica" w:eastAsia="Helvetica" w:cs="Helvetica"/>
+                <w:i w:val="false"/>
+                <w:b w:val="false"/>
+                <w:u w:val="none"/>
+                <w:strike w:val="false"/>
+                <w:sz w:val="22"/>
+                <w:szCs w:val="22"/>
+                <w:color w:val="000000"/>
+              </w:rPr>
+              <w:t xml:space="preserve">0 (-2 – 2)</w:t>
             </w:r>
           </w:p>
         </w:tc>
@@ -8041,7 +8041,7 @@
                 <w:szCs w:val="22"/>
                 <w:color w:val="000000"/>
               </w:rPr>
-              <w:t xml:space="preserve">-20 [-43 – +6]</w:t>
+              <w:t xml:space="preserve">-20 (-43 – +6)</w:t>
             </w:r>
           </w:p>
         </w:tc>
@@ -8485,115 +8485,391 @@
                 <w:szCs w:val="22"/>
                 <w:color w:val="000000"/>
               </w:rPr>
-              <w:t xml:space="preserve">   22.0 [15.0 – 38.0]</w:t>
-            </w:r>
-          </w:p>
-        </w:tc>
-        <w:tc>
-          <w:tcPr>
-            <w:tcBorders>
-              <w:bottom w:val="none" w:sz="0" w:space="0" w:color="000000"/>
-              <w:top w:val="none" w:sz="0" w:space="0" w:color="000000"/>
-              <w:left w:val="none" w:sz="0" w:space="0" w:color="000000"/>
-              <w:right w:val="none" w:sz="0" w:space="0" w:color="000000"/>
-            </w:tcBorders>
-            <w:shd w:val="clear" w:color="auto" w:fill="FFFFFF"/>
-            <w:tcMar>
-              <w:top w:w="0" w:type="dxa"/>
-              <w:bottom w:w="0" w:type="dxa"/>
-              <w:left w:w="0" w:type="dxa"/>
-              <w:right w:w="0" w:type="dxa"/>
-            </w:tcMar>
-            <w:vAlign w:val="center"/>
-          </w:tcPr>
-          <w:p>
-            <w:pPr>
-              <w:jc w:val="center"/>
-              <w:pBdr>
-                <w:bottom w:val="none" w:sz="0" w:space="0" w:color="000000"/>
-                <w:top w:val="none" w:sz="0" w:space="0" w:color="000000"/>
-                <w:left w:val="none" w:sz="0" w:space="0" w:color="000000"/>
-                <w:right w:val="none" w:sz="0" w:space="0" w:color="000000"/>
-              </w:pBdr>
-              <w:spacing w:after="100" w:before="100" w:line="240"/>
-              <w:ind w:left="100" w:right="100" w:firstLine="0" w:firstLineChars="0"/>
-              <w:rPr>
-                <w:rFonts w:ascii="Helvetica" w:hAnsi="Helvetica" w:eastAsia="Helvetica" w:cs="Helvetica"/>
-                <w:i w:val="false"/>
-                <w:b w:val="false"/>
-                <w:u w:val="none"/>
-                <w:strike w:val="false"/>
-                <w:sz w:val="22"/>
-                <w:szCs w:val="22"/>
-                <w:color w:val="000000"/>
-              </w:rPr>
-            </w:pPr>
-            <w:r>
-              <w:rPr>
-                <w:rFonts w:ascii="Helvetica" w:hAnsi="Helvetica" w:eastAsia="Helvetica" w:cs="Helvetica"/>
-                <w:i w:val="false"/>
-                <w:b w:val="false"/>
-                <w:u w:val="none"/>
-                <w:strike w:val="false"/>
-                <w:sz w:val="22"/>
-                <w:szCs w:val="22"/>
-                <w:color w:val="000000"/>
-              </w:rPr>
-              <w:t xml:space="preserve">  20.0 [11.0 – 39.0]</w:t>
-            </w:r>
-          </w:p>
-        </w:tc>
-        <w:tc>
-          <w:tcPr>
-            <w:tcBorders>
-              <w:bottom w:val="none" w:sz="0" w:space="0" w:color="000000"/>
-              <w:top w:val="none" w:sz="0" w:space="0" w:color="000000"/>
-              <w:left w:val="none" w:sz="0" w:space="0" w:color="000000"/>
-              <w:right w:val="none" w:sz="0" w:space="0" w:color="000000"/>
-            </w:tcBorders>
-            <w:shd w:val="clear" w:color="auto" w:fill="FFFFFF"/>
-            <w:tcMar>
-              <w:top w:w="0" w:type="dxa"/>
-              <w:bottom w:w="0" w:type="dxa"/>
-              <w:left w:w="0" w:type="dxa"/>
-              <w:right w:w="0" w:type="dxa"/>
-            </w:tcMar>
-            <w:vAlign w:val="center"/>
-          </w:tcPr>
-          <w:p>
-            <w:pPr>
-              <w:jc w:val="center"/>
-              <w:pBdr>
-                <w:bottom w:val="none" w:sz="0" w:space="0" w:color="000000"/>
-                <w:top w:val="none" w:sz="0" w:space="0" w:color="000000"/>
-                <w:left w:val="none" w:sz="0" w:space="0" w:color="000000"/>
-                <w:right w:val="none" w:sz="0" w:space="0" w:color="000000"/>
-              </w:pBdr>
-              <w:spacing w:after="100" w:before="100" w:line="240"/>
-              <w:ind w:left="100" w:right="100" w:firstLine="0" w:firstLineChars="0"/>
-              <w:rPr>
-                <w:rFonts w:ascii="Helvetica" w:hAnsi="Helvetica" w:eastAsia="Helvetica" w:cs="Helvetica"/>
-                <w:i w:val="false"/>
-                <w:b w:val="false"/>
-                <w:u w:val="none"/>
-                <w:strike w:val="false"/>
-                <w:sz w:val="22"/>
-                <w:szCs w:val="22"/>
-                <w:color w:val="000000"/>
-              </w:rPr>
-            </w:pPr>
-            <w:r>
-              <w:rPr>
-                <w:rFonts w:ascii="Helvetica" w:hAnsi="Helvetica" w:eastAsia="Helvetica" w:cs="Helvetica"/>
-                <w:i w:val="false"/>
-                <w:b w:val="false"/>
-                <w:u w:val="none"/>
-                <w:strike w:val="false"/>
-                <w:sz w:val="22"/>
-                <w:szCs w:val="22"/>
-                <w:color w:val="000000"/>
-              </w:rPr>
-              <w:t xml:space="preserve">2 [-8 – 10]</w:t>
+              <w:t xml:space="preserve">   22.0 (15.0 – 38.0)</w:t>
+            </w:r>
+          </w:p>
+        </w:tc>
+        <w:tc>
+          <w:tcPr>
+            <w:tcBorders>
+              <w:bottom w:val="none" w:sz="0" w:space="0" w:color="000000"/>
+              <w:top w:val="none" w:sz="0" w:space="0" w:color="000000"/>
+              <w:left w:val="none" w:sz="0" w:space="0" w:color="000000"/>
+              <w:right w:val="none" w:sz="0" w:space="0" w:color="000000"/>
+            </w:tcBorders>
+            <w:shd w:val="clear" w:color="auto" w:fill="FFFFFF"/>
+            <w:tcMar>
+              <w:top w:w="0" w:type="dxa"/>
+              <w:bottom w:w="0" w:type="dxa"/>
+              <w:left w:w="0" w:type="dxa"/>
+              <w:right w:w="0" w:type="dxa"/>
+            </w:tcMar>
+            <w:vAlign w:val="center"/>
+          </w:tcPr>
+          <w:p>
+            <w:pPr>
+              <w:jc w:val="center"/>
+              <w:pBdr>
+                <w:bottom w:val="none" w:sz="0" w:space="0" w:color="000000"/>
+                <w:top w:val="none" w:sz="0" w:space="0" w:color="000000"/>
+                <w:left w:val="none" w:sz="0" w:space="0" w:color="000000"/>
+                <w:right w:val="none" w:sz="0" w:space="0" w:color="000000"/>
+              </w:pBdr>
+              <w:spacing w:after="100" w:before="100" w:line="240"/>
+              <w:ind w:left="100" w:right="100" w:firstLine="0" w:firstLineChars="0"/>
+              <w:rPr>
+                <w:rFonts w:ascii="Helvetica" w:hAnsi="Helvetica" w:eastAsia="Helvetica" w:cs="Helvetica"/>
+                <w:i w:val="false"/>
+                <w:b w:val="false"/>
+                <w:u w:val="none"/>
+                <w:strike w:val="false"/>
+                <w:sz w:val="22"/>
+                <w:szCs w:val="22"/>
+                <w:color w:val="000000"/>
+              </w:rPr>
+            </w:pPr>
+            <w:r>
+              <w:rPr>
+                <w:rFonts w:ascii="Helvetica" w:hAnsi="Helvetica" w:eastAsia="Helvetica" w:cs="Helvetica"/>
+                <w:i w:val="false"/>
+                <w:b w:val="false"/>
+                <w:u w:val="none"/>
+                <w:strike w:val="false"/>
+                <w:sz w:val="22"/>
+                <w:szCs w:val="22"/>
+                <w:color w:val="000000"/>
+              </w:rPr>
+              <w:t xml:space="preserve">  20.0 (11.0 – 39.0)</w:t>
+            </w:r>
+          </w:p>
+        </w:tc>
+        <w:tc>
+          <w:tcPr>
+            <w:tcBorders>
+              <w:bottom w:val="none" w:sz="0" w:space="0" w:color="000000"/>
+              <w:top w:val="none" w:sz="0" w:space="0" w:color="000000"/>
+              <w:left w:val="none" w:sz="0" w:space="0" w:color="000000"/>
+              <w:right w:val="none" w:sz="0" w:space="0" w:color="000000"/>
+            </w:tcBorders>
+            <w:shd w:val="clear" w:color="auto" w:fill="FFFFFF"/>
+            <w:tcMar>
+              <w:top w:w="0" w:type="dxa"/>
+              <w:bottom w:w="0" w:type="dxa"/>
+              <w:left w:w="0" w:type="dxa"/>
+              <w:right w:w="0" w:type="dxa"/>
+            </w:tcMar>
+            <w:vAlign w:val="center"/>
+          </w:tcPr>
+          <w:p>
+            <w:pPr>
+              <w:jc w:val="center"/>
+              <w:pBdr>
+                <w:bottom w:val="none" w:sz="0" w:space="0" w:color="000000"/>
+                <w:top w:val="none" w:sz="0" w:space="0" w:color="000000"/>
+                <w:left w:val="none" w:sz="0" w:space="0" w:color="000000"/>
+                <w:right w:val="none" w:sz="0" w:space="0" w:color="000000"/>
+              </w:pBdr>
+              <w:spacing w:after="100" w:before="100" w:line="240"/>
+              <w:ind w:left="100" w:right="100" w:firstLine="0" w:firstLineChars="0"/>
+              <w:rPr>
+                <w:rFonts w:ascii="Helvetica" w:hAnsi="Helvetica" w:eastAsia="Helvetica" w:cs="Helvetica"/>
+                <w:i w:val="false"/>
+                <w:b w:val="false"/>
+                <w:u w:val="none"/>
+                <w:strike w:val="false"/>
+                <w:sz w:val="22"/>
+                <w:szCs w:val="22"/>
+                <w:color w:val="000000"/>
+              </w:rPr>
+            </w:pPr>
+            <w:r>
+              <w:rPr>
+                <w:rFonts w:ascii="Helvetica" w:hAnsi="Helvetica" w:eastAsia="Helvetica" w:cs="Helvetica"/>
+                <w:i w:val="false"/>
+                <w:b w:val="false"/>
+                <w:u w:val="none"/>
+                <w:strike w:val="false"/>
+                <w:sz w:val="22"/>
+                <w:szCs w:val="22"/>
+                <w:color w:val="000000"/>
+              </w:rPr>
+              <w:t xml:space="preserve">2 (-8 – 10)</w:t>
+            </w:r>
+          </w:p>
+        </w:tc>
+      </w:tr>
+      <w:tr>
+        <w:trPr>
+          <w:trHeight w:val="618" w:hRule="auto"/>
+        </w:trPr>
+        body31
+        <w:tc>
+          <w:tcPr>
+            <w:tcBorders>
+              <w:bottom w:val="none" w:sz="0" w:space="0" w:color="000000"/>
+              <w:top w:val="none" w:sz="0" w:space="0" w:color="000000"/>
+              <w:left w:val="none" w:sz="0" w:space="0" w:color="000000"/>
+              <w:right w:val="none" w:sz="0" w:space="0" w:color="000000"/>
+            </w:tcBorders>
+            <w:shd w:val="clear" w:color="auto" w:fill="FFFFFF"/>
+            <w:tcMar>
+              <w:top w:w="0" w:type="dxa"/>
+              <w:bottom w:w="0" w:type="dxa"/>
+              <w:left w:w="0" w:type="dxa"/>
+              <w:right w:w="0" w:type="dxa"/>
+            </w:tcMar>
+            <w:vAlign w:val="center"/>
+          </w:tcPr>
+          <w:p>
+            <w:pPr>
+              <w:jc w:val="left"/>
+              <w:pBdr>
+                <w:bottom w:val="none" w:sz="0" w:space="0" w:color="000000"/>
+                <w:top w:val="none" w:sz="0" w:space="0" w:color="000000"/>
+                <w:left w:val="none" w:sz="0" w:space="0" w:color="000000"/>
+                <w:right w:val="none" w:sz="0" w:space="0" w:color="000000"/>
+              </w:pBdr>
+              <w:spacing w:after="100" w:before="100" w:line="240"/>
+              <w:ind w:left="100" w:right="100" w:firstLine="0" w:firstLineChars="0"/>
+              <w:rPr>
+                <w:rFonts w:ascii="Helvetica" w:hAnsi="Helvetica" w:eastAsia="Helvetica" w:cs="Helvetica"/>
+                <w:i w:val="false"/>
+                <w:b w:val="false"/>
+                <w:u w:val="none"/>
+                <w:strike w:val="false"/>
+                <w:sz w:val="22"/>
+                <w:szCs w:val="22"/>
+                <w:color w:val="000000"/>
+              </w:rPr>
+            </w:pPr>
+            <w:r>
+              <w:rPr>
+                <w:rFonts w:ascii="Helvetica" w:hAnsi="Helvetica" w:eastAsia="Helvetica" w:cs="Helvetica"/>
+                <w:i w:val="false"/>
+                <w:b w:val="false"/>
+                <w:u w:val="none"/>
+                <w:strike w:val="false"/>
+                <w:sz w:val="22"/>
+                <w:szCs w:val="22"/>
+                <w:color w:val="000000"/>
+              </w:rPr>
+              <w:t xml:space="preserve">Creatinine (µmol/L)</w:t>
+            </w:r>
+          </w:p>
+        </w:tc>
+        <w:tc>
+          <w:tcPr>
+            <w:tcBorders>
+              <w:bottom w:val="none" w:sz="0" w:space="0" w:color="000000"/>
+              <w:top w:val="none" w:sz="0" w:space="0" w:color="000000"/>
+              <w:left w:val="none" w:sz="0" w:space="0" w:color="000000"/>
+              <w:right w:val="none" w:sz="0" w:space="0" w:color="000000"/>
+            </w:tcBorders>
+            <w:shd w:val="clear" w:color="auto" w:fill="FFFFFF"/>
+            <w:tcMar>
+              <w:top w:w="0" w:type="dxa"/>
+              <w:bottom w:w="0" w:type="dxa"/>
+              <w:left w:w="0" w:type="dxa"/>
+              <w:right w:w="0" w:type="dxa"/>
+            </w:tcMar>
+            <w:vAlign w:val="center"/>
+          </w:tcPr>
+          <w:p>
+            <w:pPr>
+              <w:jc w:val="center"/>
+              <w:pBdr>
+                <w:bottom w:val="none" w:sz="0" w:space="0" w:color="000000"/>
+                <w:top w:val="none" w:sz="0" w:space="0" w:color="000000"/>
+                <w:left w:val="none" w:sz="0" w:space="0" w:color="000000"/>
+                <w:right w:val="none" w:sz="0" w:space="0" w:color="000000"/>
+              </w:pBdr>
+              <w:spacing w:after="100" w:before="100" w:line="240"/>
+              <w:ind w:left="100" w:right="100" w:firstLine="0" w:firstLineChars="0"/>
+              <w:rPr>
+                <w:rFonts w:ascii="Helvetica" w:hAnsi="Helvetica" w:eastAsia="Helvetica" w:cs="Helvetica"/>
+                <w:i w:val="false"/>
+                <w:b w:val="false"/>
+                <w:u w:val="none"/>
+                <w:strike w:val="false"/>
+                <w:sz w:val="22"/>
+                <w:szCs w:val="22"/>
+                <w:color w:val="000000"/>
+              </w:rPr>
+            </w:pPr>
+            <w:r>
+              <w:rPr>
+                <w:rFonts w:ascii="Helvetica" w:hAnsi="Helvetica" w:eastAsia="Helvetica" w:cs="Helvetica"/>
+                <w:i w:val="false"/>
+                <w:b w:val="false"/>
+                <w:u w:val="none"/>
+                <w:strike w:val="false"/>
+                <w:sz w:val="22"/>
+                <w:szCs w:val="22"/>
+                <w:color w:val="000000"/>
+              </w:rPr>
+              <w:t xml:space="preserve">0</w:t>
+            </w:r>
+          </w:p>
+        </w:tc>
+        <w:tc>
+          <w:tcPr>
+            <w:tcBorders>
+              <w:bottom w:val="none" w:sz="0" w:space="0" w:color="000000"/>
+              <w:top w:val="none" w:sz="0" w:space="0" w:color="000000"/>
+              <w:left w:val="none" w:sz="0" w:space="0" w:color="000000"/>
+              <w:right w:val="none" w:sz="0" w:space="0" w:color="000000"/>
+            </w:tcBorders>
+            <w:shd w:val="clear" w:color="auto" w:fill="FFFFFF"/>
+            <w:tcMar>
+              <w:top w:w="0" w:type="dxa"/>
+              <w:bottom w:w="0" w:type="dxa"/>
+              <w:left w:w="0" w:type="dxa"/>
+              <w:right w:w="0" w:type="dxa"/>
+            </w:tcMar>
+            <w:vAlign w:val="center"/>
+          </w:tcPr>
+          <w:p>
+            <w:pPr>
+              <w:jc w:val="center"/>
+              <w:pBdr>
+                <w:bottom w:val="none" w:sz="0" w:space="0" w:color="000000"/>
+                <w:top w:val="none" w:sz="0" w:space="0" w:color="000000"/>
+                <w:left w:val="none" w:sz="0" w:space="0" w:color="000000"/>
+                <w:right w:val="none" w:sz="0" w:space="0" w:color="000000"/>
+              </w:pBdr>
+              <w:spacing w:after="100" w:before="100" w:line="240"/>
+              <w:ind w:left="100" w:right="100" w:firstLine="0" w:firstLineChars="0"/>
+              <w:rPr>
+                <w:rFonts w:ascii="Helvetica" w:hAnsi="Helvetica" w:eastAsia="Helvetica" w:cs="Helvetica"/>
+                <w:i w:val="false"/>
+                <w:b w:val="false"/>
+                <w:u w:val="none"/>
+                <w:strike w:val="false"/>
+                <w:sz w:val="22"/>
+                <w:szCs w:val="22"/>
+                <w:color w:val="000000"/>
+              </w:rPr>
+            </w:pPr>
+            <w:r>
+              <w:rPr>
+                <w:rFonts w:ascii="Helvetica" w:hAnsi="Helvetica" w:eastAsia="Helvetica" w:cs="Helvetica"/>
+                <w:i w:val="false"/>
+                <w:b w:val="false"/>
+                <w:u w:val="none"/>
+                <w:strike w:val="false"/>
+                <w:sz w:val="22"/>
+                <w:szCs w:val="22"/>
+                <w:color w:val="000000"/>
+              </w:rPr>
+              <w:t xml:space="preserve">  191.0 (156.0 – 231.0)</w:t>
+            </w:r>
+          </w:p>
+        </w:tc>
+        <w:tc>
+          <w:tcPr>
+            <w:tcBorders>
+              <w:bottom w:val="none" w:sz="0" w:space="0" w:color="000000"/>
+              <w:top w:val="none" w:sz="0" w:space="0" w:color="000000"/>
+              <w:left w:val="none" w:sz="0" w:space="0" w:color="000000"/>
+              <w:right w:val="none" w:sz="0" w:space="0" w:color="000000"/>
+            </w:tcBorders>
+            <w:shd w:val="clear" w:color="auto" w:fill="FFFFFF"/>
+            <w:tcMar>
+              <w:top w:w="0" w:type="dxa"/>
+              <w:bottom w:w="0" w:type="dxa"/>
+              <w:left w:w="0" w:type="dxa"/>
+              <w:right w:w="0" w:type="dxa"/>
+            </w:tcMar>
+            <w:vAlign w:val="center"/>
+          </w:tcPr>
+          <w:p>
+            <w:pPr>
+              <w:jc w:val="center"/>
+              <w:pBdr>
+                <w:bottom w:val="none" w:sz="0" w:space="0" w:color="000000"/>
+                <w:top w:val="none" w:sz="0" w:space="0" w:color="000000"/>
+                <w:left w:val="none" w:sz="0" w:space="0" w:color="000000"/>
+                <w:right w:val="none" w:sz="0" w:space="0" w:color="000000"/>
+              </w:pBdr>
+              <w:spacing w:after="100" w:before="100" w:line="240"/>
+              <w:ind w:left="100" w:right="100" w:firstLine="0" w:firstLineChars="0"/>
+              <w:rPr>
+                <w:rFonts w:ascii="Helvetica" w:hAnsi="Helvetica" w:eastAsia="Helvetica" w:cs="Helvetica"/>
+                <w:i w:val="false"/>
+                <w:b w:val="false"/>
+                <w:u w:val="none"/>
+                <w:strike w:val="false"/>
+                <w:sz w:val="22"/>
+                <w:szCs w:val="22"/>
+                <w:color w:val="000000"/>
+              </w:rPr>
+            </w:pPr>
+            <w:r>
+              <w:rPr>
+                <w:rFonts w:ascii="Helvetica" w:hAnsi="Helvetica" w:eastAsia="Helvetica" w:cs="Helvetica"/>
+                <w:i w:val="false"/>
+                <w:b w:val="false"/>
+                <w:u w:val="none"/>
+                <w:strike w:val="false"/>
+                <w:sz w:val="22"/>
+                <w:szCs w:val="22"/>
+                <w:color w:val="000000"/>
+              </w:rPr>
+              <w:t xml:space="preserve"> 104.0 (73.0 – 146.5)</w:t>
+            </w:r>
+          </w:p>
+        </w:tc>
+        <w:tc>
+          <w:tcPr>
+            <w:tcBorders>
+              <w:bottom w:val="none" w:sz="0" w:space="0" w:color="000000"/>
+              <w:top w:val="none" w:sz="0" w:space="0" w:color="000000"/>
+              <w:left w:val="none" w:sz="0" w:space="0" w:color="000000"/>
+              <w:right w:val="none" w:sz="0" w:space="0" w:color="000000"/>
+            </w:tcBorders>
+            <w:shd w:val="clear" w:color="auto" w:fill="FFFFFF"/>
+            <w:tcMar>
+              <w:top w:w="0" w:type="dxa"/>
+              <w:bottom w:w="0" w:type="dxa"/>
+              <w:left w:w="0" w:type="dxa"/>
+              <w:right w:w="0" w:type="dxa"/>
+            </w:tcMar>
+            <w:vAlign w:val="center"/>
+          </w:tcPr>
+          <w:p>
+            <w:pPr>
+              <w:jc w:val="center"/>
+              <w:pBdr>
+                <w:bottom w:val="none" w:sz="0" w:space="0" w:color="000000"/>
+                <w:top w:val="none" w:sz="0" w:space="0" w:color="000000"/>
+                <w:left w:val="none" w:sz="0" w:space="0" w:color="000000"/>
+                <w:right w:val="none" w:sz="0" w:space="0" w:color="000000"/>
+              </w:pBdr>
+              <w:spacing w:after="100" w:before="100" w:line="240"/>
+              <w:ind w:left="100" w:right="100" w:firstLine="0" w:firstLineChars="0"/>
+              <w:rPr>
+                <w:rFonts w:ascii="Helvetica" w:hAnsi="Helvetica" w:eastAsia="Helvetica" w:cs="Helvetica"/>
+                <w:i w:val="false"/>
+                <w:b w:val="false"/>
+                <w:u w:val="none"/>
+                <w:strike w:val="false"/>
+                <w:sz w:val="22"/>
+                <w:szCs w:val="22"/>
+                <w:color w:val="000000"/>
+              </w:rPr>
+            </w:pPr>
+            <w:r>
+              <w:rPr>
+                <w:rFonts w:ascii="Helvetica" w:hAnsi="Helvetica" w:eastAsia="Helvetica" w:cs="Helvetica"/>
+                <w:i w:val="false"/>
+                <w:b w:val="false"/>
+                <w:u w:val="none"/>
+                <w:strike w:val="false"/>
+                <w:sz w:val="22"/>
+                <w:szCs w:val="22"/>
+                <w:color w:val="000000"/>
+              </w:rPr>
+              <w:t xml:space="preserve">84 (48 – 118)</w:t>
             </w:r>
           </w:p>
         </w:tc>
@@ -8602,7 +8878,7 @@
         <w:trPr>
           <w:trHeight w:val="621" w:hRule="auto"/>
         </w:trPr>
-        body31
+        body32
         <w:tc>
           <w:tcPr>
             <w:tcBorders>
@@ -8761,115 +9037,115 @@
                 <w:szCs w:val="22"/>
                 <w:color w:val="000000"/>
               </w:rPr>
-              <w:t xml:space="preserve">35477.0 [915.0 – 319961.0]</w:t>
-            </w:r>
-          </w:p>
-        </w:tc>
-        <w:tc>
-          <w:tcPr>
-            <w:tcBorders>
-              <w:bottom w:val="none" w:sz="0" w:space="0" w:color="000000"/>
-              <w:top w:val="none" w:sz="0" w:space="0" w:color="000000"/>
-              <w:left w:val="none" w:sz="0" w:space="0" w:color="000000"/>
-              <w:right w:val="none" w:sz="0" w:space="0" w:color="000000"/>
-            </w:tcBorders>
-            <w:shd w:val="clear" w:color="auto" w:fill="FFFFFF"/>
-            <w:tcMar>
-              <w:top w:w="0" w:type="dxa"/>
-              <w:bottom w:w="0" w:type="dxa"/>
-              <w:left w:w="0" w:type="dxa"/>
-              <w:right w:w="0" w:type="dxa"/>
-            </w:tcMar>
-            <w:vAlign w:val="center"/>
-          </w:tcPr>
-          <w:p>
-            <w:pPr>
-              <w:jc w:val="center"/>
-              <w:pBdr>
-                <w:bottom w:val="none" w:sz="0" w:space="0" w:color="000000"/>
-                <w:top w:val="none" w:sz="0" w:space="0" w:color="000000"/>
-                <w:left w:val="none" w:sz="0" w:space="0" w:color="000000"/>
-                <w:right w:val="none" w:sz="0" w:space="0" w:color="000000"/>
-              </w:pBdr>
-              <w:spacing w:after="100" w:before="100" w:line="240"/>
-              <w:ind w:left="100" w:right="100" w:firstLine="0" w:firstLineChars="0"/>
-              <w:rPr>
-                <w:rFonts w:ascii="Helvetica" w:hAnsi="Helvetica" w:eastAsia="Helvetica" w:cs="Helvetica"/>
-                <w:i w:val="false"/>
-                <w:b w:val="false"/>
-                <w:u w:val="none"/>
-                <w:strike w:val="false"/>
-                <w:sz w:val="22"/>
-                <w:szCs w:val="22"/>
-                <w:color w:val="000000"/>
-              </w:rPr>
-            </w:pPr>
-            <w:r>
-              <w:rPr>
-                <w:rFonts w:ascii="Helvetica" w:hAnsi="Helvetica" w:eastAsia="Helvetica" w:cs="Helvetica"/>
-                <w:i w:val="false"/>
-                <w:b w:val="false"/>
-                <w:u w:val="none"/>
-                <w:strike w:val="false"/>
-                <w:sz w:val="22"/>
-                <w:szCs w:val="22"/>
-                <w:color w:val="000000"/>
-              </w:rPr>
-              <w:t xml:space="preserve">1613.0 [191.2 – 107779.0]</w:t>
-            </w:r>
-          </w:p>
-        </w:tc>
-        <w:tc>
-          <w:tcPr>
-            <w:tcBorders>
-              <w:bottom w:val="none" w:sz="0" w:space="0" w:color="000000"/>
-              <w:top w:val="none" w:sz="0" w:space="0" w:color="000000"/>
-              <w:left w:val="none" w:sz="0" w:space="0" w:color="000000"/>
-              <w:right w:val="none" w:sz="0" w:space="0" w:color="000000"/>
-            </w:tcBorders>
-            <w:shd w:val="clear" w:color="auto" w:fill="FFFFFF"/>
-            <w:tcMar>
-              <w:top w:w="0" w:type="dxa"/>
-              <w:bottom w:w="0" w:type="dxa"/>
-              <w:left w:w="0" w:type="dxa"/>
-              <w:right w:w="0" w:type="dxa"/>
-            </w:tcMar>
-            <w:vAlign w:val="center"/>
-          </w:tcPr>
-          <w:p>
-            <w:pPr>
-              <w:jc w:val="center"/>
-              <w:pBdr>
-                <w:bottom w:val="none" w:sz="0" w:space="0" w:color="000000"/>
-                <w:top w:val="none" w:sz="0" w:space="0" w:color="000000"/>
-                <w:left w:val="none" w:sz="0" w:space="0" w:color="000000"/>
-                <w:right w:val="none" w:sz="0" w:space="0" w:color="000000"/>
-              </w:pBdr>
-              <w:spacing w:after="100" w:before="100" w:line="240"/>
-              <w:ind w:left="100" w:right="100" w:firstLine="0" w:firstLineChars="0"/>
-              <w:rPr>
-                <w:rFonts w:ascii="Helvetica" w:hAnsi="Helvetica" w:eastAsia="Helvetica" w:cs="Helvetica"/>
-                <w:i w:val="false"/>
-                <w:b w:val="false"/>
-                <w:u w:val="none"/>
-                <w:strike w:val="false"/>
-                <w:sz w:val="22"/>
-                <w:szCs w:val="22"/>
-                <w:color w:val="000000"/>
-              </w:rPr>
-            </w:pPr>
-            <w:r>
-              <w:rPr>
-                <w:rFonts w:ascii="Helvetica" w:hAnsi="Helvetica" w:eastAsia="Helvetica" w:cs="Helvetica"/>
-                <w:i w:val="false"/>
-                <w:b w:val="false"/>
-                <w:u w:val="none"/>
-                <w:strike w:val="false"/>
-                <w:sz w:val="22"/>
-                <w:szCs w:val="22"/>
-                <w:color w:val="000000"/>
-              </w:rPr>
-              <w:t xml:space="preserve">808 [-37072 – 140244]</w:t>
+              <w:t xml:space="preserve">35477.0 (915.0 – 319961.0)</w:t>
+            </w:r>
+          </w:p>
+        </w:tc>
+        <w:tc>
+          <w:tcPr>
+            <w:tcBorders>
+              <w:bottom w:val="none" w:sz="0" w:space="0" w:color="000000"/>
+              <w:top w:val="none" w:sz="0" w:space="0" w:color="000000"/>
+              <w:left w:val="none" w:sz="0" w:space="0" w:color="000000"/>
+              <w:right w:val="none" w:sz="0" w:space="0" w:color="000000"/>
+            </w:tcBorders>
+            <w:shd w:val="clear" w:color="auto" w:fill="FFFFFF"/>
+            <w:tcMar>
+              <w:top w:w="0" w:type="dxa"/>
+              <w:bottom w:w="0" w:type="dxa"/>
+              <w:left w:w="0" w:type="dxa"/>
+              <w:right w:w="0" w:type="dxa"/>
+            </w:tcMar>
+            <w:vAlign w:val="center"/>
+          </w:tcPr>
+          <w:p>
+            <w:pPr>
+              <w:jc w:val="center"/>
+              <w:pBdr>
+                <w:bottom w:val="none" w:sz="0" w:space="0" w:color="000000"/>
+                <w:top w:val="none" w:sz="0" w:space="0" w:color="000000"/>
+                <w:left w:val="none" w:sz="0" w:space="0" w:color="000000"/>
+                <w:right w:val="none" w:sz="0" w:space="0" w:color="000000"/>
+              </w:pBdr>
+              <w:spacing w:after="100" w:before="100" w:line="240"/>
+              <w:ind w:left="100" w:right="100" w:firstLine="0" w:firstLineChars="0"/>
+              <w:rPr>
+                <w:rFonts w:ascii="Helvetica" w:hAnsi="Helvetica" w:eastAsia="Helvetica" w:cs="Helvetica"/>
+                <w:i w:val="false"/>
+                <w:b w:val="false"/>
+                <w:u w:val="none"/>
+                <w:strike w:val="false"/>
+                <w:sz w:val="22"/>
+                <w:szCs w:val="22"/>
+                <w:color w:val="000000"/>
+              </w:rPr>
+            </w:pPr>
+            <w:r>
+              <w:rPr>
+                <w:rFonts w:ascii="Helvetica" w:hAnsi="Helvetica" w:eastAsia="Helvetica" w:cs="Helvetica"/>
+                <w:i w:val="false"/>
+                <w:b w:val="false"/>
+                <w:u w:val="none"/>
+                <w:strike w:val="false"/>
+                <w:sz w:val="22"/>
+                <w:szCs w:val="22"/>
+                <w:color w:val="000000"/>
+              </w:rPr>
+              <w:t xml:space="preserve">1613.0 (191.2 – 107779.0)</w:t>
+            </w:r>
+          </w:p>
+        </w:tc>
+        <w:tc>
+          <w:tcPr>
+            <w:tcBorders>
+              <w:bottom w:val="none" w:sz="0" w:space="0" w:color="000000"/>
+              <w:top w:val="none" w:sz="0" w:space="0" w:color="000000"/>
+              <w:left w:val="none" w:sz="0" w:space="0" w:color="000000"/>
+              <w:right w:val="none" w:sz="0" w:space="0" w:color="000000"/>
+            </w:tcBorders>
+            <w:shd w:val="clear" w:color="auto" w:fill="FFFFFF"/>
+            <w:tcMar>
+              <w:top w:w="0" w:type="dxa"/>
+              <w:bottom w:w="0" w:type="dxa"/>
+              <w:left w:w="0" w:type="dxa"/>
+              <w:right w:w="0" w:type="dxa"/>
+            </w:tcMar>
+            <w:vAlign w:val="center"/>
+          </w:tcPr>
+          <w:p>
+            <w:pPr>
+              <w:jc w:val="center"/>
+              <w:pBdr>
+                <w:bottom w:val="none" w:sz="0" w:space="0" w:color="000000"/>
+                <w:top w:val="none" w:sz="0" w:space="0" w:color="000000"/>
+                <w:left w:val="none" w:sz="0" w:space="0" w:color="000000"/>
+                <w:right w:val="none" w:sz="0" w:space="0" w:color="000000"/>
+              </w:pBdr>
+              <w:spacing w:after="100" w:before="100" w:line="240"/>
+              <w:ind w:left="100" w:right="100" w:firstLine="0" w:firstLineChars="0"/>
+              <w:rPr>
+                <w:rFonts w:ascii="Helvetica" w:hAnsi="Helvetica" w:eastAsia="Helvetica" w:cs="Helvetica"/>
+                <w:i w:val="false"/>
+                <w:b w:val="false"/>
+                <w:u w:val="none"/>
+                <w:strike w:val="false"/>
+                <w:sz w:val="22"/>
+                <w:szCs w:val="22"/>
+                <w:color w:val="000000"/>
+              </w:rPr>
+            </w:pPr>
+            <w:r>
+              <w:rPr>
+                <w:rFonts w:ascii="Helvetica" w:hAnsi="Helvetica" w:eastAsia="Helvetica" w:cs="Helvetica"/>
+                <w:i w:val="false"/>
+                <w:b w:val="false"/>
+                <w:u w:val="none"/>
+                <w:strike w:val="false"/>
+                <w:sz w:val="22"/>
+                <w:szCs w:val="22"/>
+                <w:color w:val="000000"/>
+              </w:rPr>
+              <w:t xml:space="preserve">808 (-37072 – 140244)</w:t>
             </w:r>
           </w:p>
         </w:tc>
@@ -8878,7 +9154,7 @@
         <w:trPr>
           <w:trHeight w:val="620" w:hRule="auto"/>
         </w:trPr>
-        body32
+        body33
         <w:tc>
           <w:tcPr>
             <w:tcBorders>
@@ -9037,115 +9313,115 @@
                 <w:szCs w:val="22"/>
                 <w:color w:val="000000"/>
               </w:rPr>
-              <w:t xml:space="preserve">18949.0 [7631.0 – 28778.0]</w:t>
-            </w:r>
-          </w:p>
-        </w:tc>
-        <w:tc>
-          <w:tcPr>
-            <w:tcBorders>
-              <w:bottom w:val="none" w:sz="0" w:space="0" w:color="000000"/>
-              <w:top w:val="none" w:sz="0" w:space="0" w:color="000000"/>
-              <w:left w:val="none" w:sz="0" w:space="0" w:color="000000"/>
-              <w:right w:val="none" w:sz="0" w:space="0" w:color="000000"/>
-            </w:tcBorders>
-            <w:shd w:val="clear" w:color="auto" w:fill="FFFFFF"/>
-            <w:tcMar>
-              <w:top w:w="0" w:type="dxa"/>
-              <w:bottom w:w="0" w:type="dxa"/>
-              <w:left w:w="0" w:type="dxa"/>
-              <w:right w:w="0" w:type="dxa"/>
-            </w:tcMar>
-            <w:vAlign w:val="center"/>
-          </w:tcPr>
-          <w:p>
-            <w:pPr>
-              <w:jc w:val="center"/>
-              <w:pBdr>
-                <w:bottom w:val="none" w:sz="0" w:space="0" w:color="000000"/>
-                <w:top w:val="none" w:sz="0" w:space="0" w:color="000000"/>
-                <w:left w:val="none" w:sz="0" w:space="0" w:color="000000"/>
-                <w:right w:val="none" w:sz="0" w:space="0" w:color="000000"/>
-              </w:pBdr>
-              <w:spacing w:after="100" w:before="100" w:line="240"/>
-              <w:ind w:left="100" w:right="100" w:firstLine="0" w:firstLineChars="0"/>
-              <w:rPr>
-                <w:rFonts w:ascii="Helvetica" w:hAnsi="Helvetica" w:eastAsia="Helvetica" w:cs="Helvetica"/>
-                <w:i w:val="false"/>
-                <w:b w:val="false"/>
-                <w:u w:val="none"/>
-                <w:strike w:val="false"/>
-                <w:sz w:val="22"/>
-                <w:szCs w:val="22"/>
-                <w:color w:val="000000"/>
-              </w:rPr>
-            </w:pPr>
-            <w:r>
-              <w:rPr>
-                <w:rFonts w:ascii="Helvetica" w:hAnsi="Helvetica" w:eastAsia="Helvetica" w:cs="Helvetica"/>
-                <w:i w:val="false"/>
-                <w:b w:val="false"/>
-                <w:u w:val="none"/>
-                <w:strike w:val="false"/>
-                <w:sz w:val="22"/>
-                <w:szCs w:val="22"/>
-                <w:color w:val="000000"/>
-              </w:rPr>
-              <w:t xml:space="preserve">4240.0 [1669.5 – 9305.0]</w:t>
-            </w:r>
-          </w:p>
-        </w:tc>
-        <w:tc>
-          <w:tcPr>
-            <w:tcBorders>
-              <w:bottom w:val="none" w:sz="0" w:space="0" w:color="000000"/>
-              <w:top w:val="none" w:sz="0" w:space="0" w:color="000000"/>
-              <w:left w:val="none" w:sz="0" w:space="0" w:color="000000"/>
-              <w:right w:val="none" w:sz="0" w:space="0" w:color="000000"/>
-            </w:tcBorders>
-            <w:shd w:val="clear" w:color="auto" w:fill="FFFFFF"/>
-            <w:tcMar>
-              <w:top w:w="0" w:type="dxa"/>
-              <w:bottom w:w="0" w:type="dxa"/>
-              <w:left w:w="0" w:type="dxa"/>
-              <w:right w:w="0" w:type="dxa"/>
-            </w:tcMar>
-            <w:vAlign w:val="center"/>
-          </w:tcPr>
-          <w:p>
-            <w:pPr>
-              <w:jc w:val="center"/>
-              <w:pBdr>
-                <w:bottom w:val="none" w:sz="0" w:space="0" w:color="000000"/>
-                <w:top w:val="none" w:sz="0" w:space="0" w:color="000000"/>
-                <w:left w:val="none" w:sz="0" w:space="0" w:color="000000"/>
-                <w:right w:val="none" w:sz="0" w:space="0" w:color="000000"/>
-              </w:pBdr>
-              <w:spacing w:after="100" w:before="100" w:line="240"/>
-              <w:ind w:left="100" w:right="100" w:firstLine="0" w:firstLineChars="0"/>
-              <w:rPr>
-                <w:rFonts w:ascii="Helvetica" w:hAnsi="Helvetica" w:eastAsia="Helvetica" w:cs="Helvetica"/>
-                <w:i w:val="false"/>
-                <w:b w:val="false"/>
-                <w:u w:val="none"/>
-                <w:strike w:val="false"/>
-                <w:sz w:val="22"/>
-                <w:szCs w:val="22"/>
-                <w:color w:val="000000"/>
-              </w:rPr>
-            </w:pPr>
-            <w:r>
-              <w:rPr>
-                <w:rFonts w:ascii="Helvetica" w:hAnsi="Helvetica" w:eastAsia="Helvetica" w:cs="Helvetica"/>
-                <w:i w:val="false"/>
-                <w:b w:val="false"/>
-                <w:u w:val="none"/>
-                <w:strike w:val="false"/>
-                <w:sz w:val="22"/>
-                <w:szCs w:val="22"/>
-                <w:color w:val="000000"/>
-              </w:rPr>
-              <w:t xml:space="preserve">13428 [-1811 – 25423]</w:t>
+              <w:t xml:space="preserve">18949.0 (7631.0 – 28778.0)</w:t>
+            </w:r>
+          </w:p>
+        </w:tc>
+        <w:tc>
+          <w:tcPr>
+            <w:tcBorders>
+              <w:bottom w:val="none" w:sz="0" w:space="0" w:color="000000"/>
+              <w:top w:val="none" w:sz="0" w:space="0" w:color="000000"/>
+              <w:left w:val="none" w:sz="0" w:space="0" w:color="000000"/>
+              <w:right w:val="none" w:sz="0" w:space="0" w:color="000000"/>
+            </w:tcBorders>
+            <w:shd w:val="clear" w:color="auto" w:fill="FFFFFF"/>
+            <w:tcMar>
+              <w:top w:w="0" w:type="dxa"/>
+              <w:bottom w:w="0" w:type="dxa"/>
+              <w:left w:w="0" w:type="dxa"/>
+              <w:right w:w="0" w:type="dxa"/>
+            </w:tcMar>
+            <w:vAlign w:val="center"/>
+          </w:tcPr>
+          <w:p>
+            <w:pPr>
+              <w:jc w:val="center"/>
+              <w:pBdr>
+                <w:bottom w:val="none" w:sz="0" w:space="0" w:color="000000"/>
+                <w:top w:val="none" w:sz="0" w:space="0" w:color="000000"/>
+                <w:left w:val="none" w:sz="0" w:space="0" w:color="000000"/>
+                <w:right w:val="none" w:sz="0" w:space="0" w:color="000000"/>
+              </w:pBdr>
+              <w:spacing w:after="100" w:before="100" w:line="240"/>
+              <w:ind w:left="100" w:right="100" w:firstLine="0" w:firstLineChars="0"/>
+              <w:rPr>
+                <w:rFonts w:ascii="Helvetica" w:hAnsi="Helvetica" w:eastAsia="Helvetica" w:cs="Helvetica"/>
+                <w:i w:val="false"/>
+                <w:b w:val="false"/>
+                <w:u w:val="none"/>
+                <w:strike w:val="false"/>
+                <w:sz w:val="22"/>
+                <w:szCs w:val="22"/>
+                <w:color w:val="000000"/>
+              </w:rPr>
+            </w:pPr>
+            <w:r>
+              <w:rPr>
+                <w:rFonts w:ascii="Helvetica" w:hAnsi="Helvetica" w:eastAsia="Helvetica" w:cs="Helvetica"/>
+                <w:i w:val="false"/>
+                <w:b w:val="false"/>
+                <w:u w:val="none"/>
+                <w:strike w:val="false"/>
+                <w:sz w:val="22"/>
+                <w:szCs w:val="22"/>
+                <w:color w:val="000000"/>
+              </w:rPr>
+              <w:t xml:space="preserve">4240.0 (1669.5 – 9305.0)</w:t>
+            </w:r>
+          </w:p>
+        </w:tc>
+        <w:tc>
+          <w:tcPr>
+            <w:tcBorders>
+              <w:bottom w:val="none" w:sz="0" w:space="0" w:color="000000"/>
+              <w:top w:val="none" w:sz="0" w:space="0" w:color="000000"/>
+              <w:left w:val="none" w:sz="0" w:space="0" w:color="000000"/>
+              <w:right w:val="none" w:sz="0" w:space="0" w:color="000000"/>
+            </w:tcBorders>
+            <w:shd w:val="clear" w:color="auto" w:fill="FFFFFF"/>
+            <w:tcMar>
+              <w:top w:w="0" w:type="dxa"/>
+              <w:bottom w:w="0" w:type="dxa"/>
+              <w:left w:w="0" w:type="dxa"/>
+              <w:right w:w="0" w:type="dxa"/>
+            </w:tcMar>
+            <w:vAlign w:val="center"/>
+          </w:tcPr>
+          <w:p>
+            <w:pPr>
+              <w:jc w:val="center"/>
+              <w:pBdr>
+                <w:bottom w:val="none" w:sz="0" w:space="0" w:color="000000"/>
+                <w:top w:val="none" w:sz="0" w:space="0" w:color="000000"/>
+                <w:left w:val="none" w:sz="0" w:space="0" w:color="000000"/>
+                <w:right w:val="none" w:sz="0" w:space="0" w:color="000000"/>
+              </w:pBdr>
+              <w:spacing w:after="100" w:before="100" w:line="240"/>
+              <w:ind w:left="100" w:right="100" w:firstLine="0" w:firstLineChars="0"/>
+              <w:rPr>
+                <w:rFonts w:ascii="Helvetica" w:hAnsi="Helvetica" w:eastAsia="Helvetica" w:cs="Helvetica"/>
+                <w:i w:val="false"/>
+                <w:b w:val="false"/>
+                <w:u w:val="none"/>
+                <w:strike w:val="false"/>
+                <w:sz w:val="22"/>
+                <w:szCs w:val="22"/>
+                <w:color w:val="000000"/>
+              </w:rPr>
+            </w:pPr>
+            <w:r>
+              <w:rPr>
+                <w:rFonts w:ascii="Helvetica" w:hAnsi="Helvetica" w:eastAsia="Helvetica" w:cs="Helvetica"/>
+                <w:i w:val="false"/>
+                <w:b w:val="false"/>
+                <w:u w:val="none"/>
+                <w:strike w:val="false"/>
+                <w:sz w:val="22"/>
+                <w:szCs w:val="22"/>
+                <w:color w:val="000000"/>
+              </w:rPr>
+              <w:t xml:space="preserve">13428 (-1811 – 25423)</w:t>
             </w:r>
           </w:p>
         </w:tc>
@@ -9154,7 +9430,7 @@
         <w:trPr>
           <w:trHeight w:val="619" w:hRule="auto"/>
         </w:trPr>
-        body33
+        body34
         <w:tc>
           <w:tcPr>
             <w:tcBorders>
@@ -9313,391 +9589,115 @@
                 <w:szCs w:val="22"/>
                 <w:color w:val="000000"/>
               </w:rPr>
-              <w:t xml:space="preserve">  139.0 [98.0 – 272.5]</w:t>
-            </w:r>
-          </w:p>
-        </w:tc>
-        <w:tc>
-          <w:tcPr>
-            <w:tcBorders>
-              <w:bottom w:val="none" w:sz="0" w:space="0" w:color="000000"/>
-              <w:top w:val="none" w:sz="0" w:space="0" w:color="000000"/>
-              <w:left w:val="none" w:sz="0" w:space="0" w:color="000000"/>
-              <w:right w:val="none" w:sz="0" w:space="0" w:color="000000"/>
-            </w:tcBorders>
-            <w:shd w:val="clear" w:color="auto" w:fill="FFFFFF"/>
-            <w:tcMar>
-              <w:top w:w="0" w:type="dxa"/>
-              <w:bottom w:w="0" w:type="dxa"/>
-              <w:left w:w="0" w:type="dxa"/>
-              <w:right w:w="0" w:type="dxa"/>
-            </w:tcMar>
-            <w:vAlign w:val="center"/>
-          </w:tcPr>
-          <w:p>
-            <w:pPr>
-              <w:jc w:val="center"/>
-              <w:pBdr>
-                <w:bottom w:val="none" w:sz="0" w:space="0" w:color="000000"/>
-                <w:top w:val="none" w:sz="0" w:space="0" w:color="000000"/>
-                <w:left w:val="none" w:sz="0" w:space="0" w:color="000000"/>
-                <w:right w:val="none" w:sz="0" w:space="0" w:color="000000"/>
-              </w:pBdr>
-              <w:spacing w:after="100" w:before="100" w:line="240"/>
-              <w:ind w:left="100" w:right="100" w:firstLine="0" w:firstLineChars="0"/>
-              <w:rPr>
-                <w:rFonts w:ascii="Helvetica" w:hAnsi="Helvetica" w:eastAsia="Helvetica" w:cs="Helvetica"/>
-                <w:i w:val="false"/>
-                <w:b w:val="false"/>
-                <w:u w:val="none"/>
-                <w:strike w:val="false"/>
-                <w:sz w:val="22"/>
-                <w:szCs w:val="22"/>
-                <w:color w:val="000000"/>
-              </w:rPr>
-            </w:pPr>
-            <w:r>
-              <w:rPr>
-                <w:rFonts w:ascii="Helvetica" w:hAnsi="Helvetica" w:eastAsia="Helvetica" w:cs="Helvetica"/>
-                <w:i w:val="false"/>
-                <w:b w:val="false"/>
-                <w:u w:val="none"/>
-                <w:strike w:val="false"/>
-                <w:sz w:val="22"/>
-                <w:szCs w:val="22"/>
-                <w:color w:val="000000"/>
-              </w:rPr>
-              <w:t xml:space="preserve"> 208.5 [149.5 – 272.2]</w:t>
-            </w:r>
-          </w:p>
-        </w:tc>
-        <w:tc>
-          <w:tcPr>
-            <w:tcBorders>
-              <w:bottom w:val="none" w:sz="0" w:space="0" w:color="000000"/>
-              <w:top w:val="none" w:sz="0" w:space="0" w:color="000000"/>
-              <w:left w:val="none" w:sz="0" w:space="0" w:color="000000"/>
-              <w:right w:val="none" w:sz="0" w:space="0" w:color="000000"/>
-            </w:tcBorders>
-            <w:shd w:val="clear" w:color="auto" w:fill="FFFFFF"/>
-            <w:tcMar>
-              <w:top w:w="0" w:type="dxa"/>
-              <w:bottom w:w="0" w:type="dxa"/>
-              <w:left w:w="0" w:type="dxa"/>
-              <w:right w:w="0" w:type="dxa"/>
-            </w:tcMar>
-            <w:vAlign w:val="center"/>
-          </w:tcPr>
-          <w:p>
-            <w:pPr>
-              <w:jc w:val="center"/>
-              <w:pBdr>
-                <w:bottom w:val="none" w:sz="0" w:space="0" w:color="000000"/>
-                <w:top w:val="none" w:sz="0" w:space="0" w:color="000000"/>
-                <w:left w:val="none" w:sz="0" w:space="0" w:color="000000"/>
-                <w:right w:val="none" w:sz="0" w:space="0" w:color="000000"/>
-              </w:pBdr>
-              <w:spacing w:after="100" w:before="100" w:line="240"/>
-              <w:ind w:left="100" w:right="100" w:firstLine="0" w:firstLineChars="0"/>
-              <w:rPr>
-                <w:rFonts w:ascii="Helvetica" w:hAnsi="Helvetica" w:eastAsia="Helvetica" w:cs="Helvetica"/>
-                <w:i w:val="false"/>
-                <w:b w:val="false"/>
-                <w:u w:val="none"/>
-                <w:strike w:val="false"/>
-                <w:sz w:val="22"/>
-                <w:szCs w:val="22"/>
-                <w:color w:val="000000"/>
-              </w:rPr>
-            </w:pPr>
-            <w:r>
-              <w:rPr>
-                <w:rFonts w:ascii="Helvetica" w:hAnsi="Helvetica" w:eastAsia="Helvetica" w:cs="Helvetica"/>
-                <w:i w:val="false"/>
-                <w:b w:val="false"/>
-                <w:u w:val="none"/>
-                <w:strike w:val="false"/>
-                <w:sz w:val="22"/>
-                <w:szCs w:val="22"/>
-                <w:color w:val="000000"/>
-              </w:rPr>
-              <w:t xml:space="preserve">-40 [-96 – 26]</w:t>
-            </w:r>
-          </w:p>
-        </w:tc>
-      </w:tr>
-      <w:tr>
-        <w:trPr>
-          <w:trHeight w:val="411" w:hRule="auto"/>
-        </w:trPr>
-        body34
-        <w:tc>
-          <w:tcPr>
-            <w:tcBorders>
-              <w:bottom w:val="none" w:sz="0" w:space="0" w:color="000000"/>
-              <w:top w:val="none" w:sz="0" w:space="0" w:color="000000"/>
-              <w:left w:val="none" w:sz="0" w:space="0" w:color="000000"/>
-              <w:right w:val="none" w:sz="0" w:space="0" w:color="000000"/>
-            </w:tcBorders>
-            <w:shd w:val="clear" w:color="auto" w:fill="FFFFFF"/>
-            <w:tcMar>
-              <w:top w:w="0" w:type="dxa"/>
-              <w:bottom w:w="0" w:type="dxa"/>
-              <w:left w:w="0" w:type="dxa"/>
-              <w:right w:w="0" w:type="dxa"/>
-            </w:tcMar>
-            <w:vAlign w:val="center"/>
-          </w:tcPr>
-          <w:p>
-            <w:pPr>
-              <w:jc w:val="left"/>
-              <w:pBdr>
-                <w:bottom w:val="none" w:sz="0" w:space="0" w:color="000000"/>
-                <w:top w:val="none" w:sz="0" w:space="0" w:color="000000"/>
-                <w:left w:val="none" w:sz="0" w:space="0" w:color="000000"/>
-                <w:right w:val="none" w:sz="0" w:space="0" w:color="000000"/>
-              </w:pBdr>
-              <w:spacing w:after="100" w:before="100" w:line="240"/>
-              <w:ind w:left="100" w:right="100" w:firstLine="0" w:firstLineChars="0"/>
-              <w:rPr>
-                <w:rFonts w:ascii="Helvetica" w:hAnsi="Helvetica" w:eastAsia="Helvetica" w:cs="Helvetica"/>
-                <w:i w:val="false"/>
-                <w:b w:val="true"/>
-                <w:u w:val="none"/>
-                <w:strike w:val="false"/>
-                <w:sz w:val="22"/>
-                <w:szCs w:val="22"/>
-                <w:color w:val="000000"/>
-              </w:rPr>
-            </w:pPr>
-            <w:r>
-              <w:rPr>
-                <w:rFonts w:ascii="Helvetica" w:hAnsi="Helvetica" w:eastAsia="Helvetica" w:cs="Helvetica"/>
-                <w:i w:val="false"/>
-                <w:b w:val="true"/>
-                <w:u w:val="none"/>
-                <w:strike w:val="false"/>
-                <w:sz w:val="22"/>
-                <w:szCs w:val="22"/>
-                <w:color w:val="000000"/>
-              </w:rPr>
-              <w:t xml:space="preserve"/>
-            </w:r>
-          </w:p>
-        </w:tc>
-        <w:tc>
-          <w:tcPr>
-            <w:tcBorders>
-              <w:bottom w:val="none" w:sz="0" w:space="0" w:color="000000"/>
-              <w:top w:val="none" w:sz="0" w:space="0" w:color="000000"/>
-              <w:left w:val="none" w:sz="0" w:space="0" w:color="000000"/>
-              <w:right w:val="none" w:sz="0" w:space="0" w:color="000000"/>
-            </w:tcBorders>
-            <w:shd w:val="clear" w:color="auto" w:fill="FFFFFF"/>
-            <w:tcMar>
-              <w:top w:w="0" w:type="dxa"/>
-              <w:bottom w:w="0" w:type="dxa"/>
-              <w:left w:w="0" w:type="dxa"/>
-              <w:right w:w="0" w:type="dxa"/>
-            </w:tcMar>
-            <w:vAlign w:val="center"/>
-          </w:tcPr>
-          <w:p>
-            <w:pPr>
-              <w:jc w:val="center"/>
-              <w:pBdr>
-                <w:bottom w:val="none" w:sz="0" w:space="0" w:color="000000"/>
-                <w:top w:val="none" w:sz="0" w:space="0" w:color="000000"/>
-                <w:left w:val="none" w:sz="0" w:space="0" w:color="000000"/>
-                <w:right w:val="none" w:sz="0" w:space="0" w:color="000000"/>
-              </w:pBdr>
-              <w:spacing w:after="100" w:before="100" w:line="240"/>
-              <w:ind w:left="100" w:right="100" w:firstLine="0" w:firstLineChars="0"/>
-              <w:rPr>
-                <w:rFonts w:ascii="Helvetica" w:hAnsi="Helvetica" w:eastAsia="Helvetica" w:cs="Helvetica"/>
-                <w:i w:val="false"/>
-                <w:b w:val="true"/>
-                <w:u w:val="none"/>
-                <w:strike w:val="false"/>
-                <w:sz w:val="22"/>
-                <w:szCs w:val="22"/>
-                <w:color w:val="000000"/>
-              </w:rPr>
-            </w:pPr>
-            <w:r>
-              <w:rPr>
-                <w:rFonts w:ascii="Helvetica" w:hAnsi="Helvetica" w:eastAsia="Helvetica" w:cs="Helvetica"/>
-                <w:i w:val="false"/>
-                <w:b w:val="true"/>
-                <w:u w:val="none"/>
-                <w:strike w:val="false"/>
-                <w:sz w:val="22"/>
-                <w:szCs w:val="22"/>
-                <w:color w:val="000000"/>
-              </w:rPr>
-              <w:t xml:space="preserve"/>
-            </w:r>
-          </w:p>
-        </w:tc>
-        <w:tc>
-          <w:tcPr>
-            <w:tcBorders>
-              <w:bottom w:val="none" w:sz="0" w:space="0" w:color="000000"/>
-              <w:top w:val="none" w:sz="0" w:space="0" w:color="000000"/>
-              <w:left w:val="none" w:sz="0" w:space="0" w:color="000000"/>
-              <w:right w:val="none" w:sz="0" w:space="0" w:color="000000"/>
-            </w:tcBorders>
-            <w:shd w:val="clear" w:color="auto" w:fill="FFFFFF"/>
-            <w:tcMar>
-              <w:top w:w="0" w:type="dxa"/>
-              <w:bottom w:w="0" w:type="dxa"/>
-              <w:left w:w="0" w:type="dxa"/>
-              <w:right w:w="0" w:type="dxa"/>
-            </w:tcMar>
-            <w:vAlign w:val="center"/>
-          </w:tcPr>
-          <w:p>
-            <w:pPr>
-              <w:jc w:val="center"/>
-              <w:pBdr>
-                <w:bottom w:val="none" w:sz="0" w:space="0" w:color="000000"/>
-                <w:top w:val="none" w:sz="0" w:space="0" w:color="000000"/>
-                <w:left w:val="none" w:sz="0" w:space="0" w:color="000000"/>
-                <w:right w:val="none" w:sz="0" w:space="0" w:color="000000"/>
-              </w:pBdr>
-              <w:spacing w:after="100" w:before="100" w:line="240"/>
-              <w:ind w:left="100" w:right="100" w:firstLine="0" w:firstLineChars="0"/>
-              <w:rPr>
-                <w:rFonts w:ascii="Helvetica" w:hAnsi="Helvetica" w:eastAsia="Helvetica" w:cs="Helvetica"/>
-                <w:i w:val="false"/>
-                <w:b w:val="true"/>
-                <w:u w:val="none"/>
-                <w:strike w:val="false"/>
-                <w:sz w:val="22"/>
-                <w:szCs w:val="22"/>
-                <w:color w:val="000000"/>
-              </w:rPr>
-            </w:pPr>
-            <w:r>
-              <w:rPr>
-                <w:rFonts w:ascii="Helvetica" w:hAnsi="Helvetica" w:eastAsia="Helvetica" w:cs="Helvetica"/>
-                <w:i w:val="false"/>
-                <w:b w:val="true"/>
-                <w:u w:val="none"/>
-                <w:strike w:val="false"/>
-                <w:sz w:val="22"/>
-                <w:szCs w:val="22"/>
-                <w:color w:val="000000"/>
-              </w:rPr>
-              <w:t xml:space="preserve"/>
-            </w:r>
-          </w:p>
-        </w:tc>
-        <w:tc>
-          <w:tcPr>
-            <w:tcBorders>
-              <w:bottom w:val="none" w:sz="0" w:space="0" w:color="000000"/>
-              <w:top w:val="none" w:sz="0" w:space="0" w:color="000000"/>
-              <w:left w:val="none" w:sz="0" w:space="0" w:color="000000"/>
-              <w:right w:val="none" w:sz="0" w:space="0" w:color="000000"/>
-            </w:tcBorders>
-            <w:shd w:val="clear" w:color="auto" w:fill="FFFFFF"/>
-            <w:tcMar>
-              <w:top w:w="0" w:type="dxa"/>
-              <w:bottom w:w="0" w:type="dxa"/>
-              <w:left w:w="0" w:type="dxa"/>
-              <w:right w:w="0" w:type="dxa"/>
-            </w:tcMar>
-            <w:vAlign w:val="center"/>
-          </w:tcPr>
-          <w:p>
-            <w:pPr>
-              <w:jc w:val="center"/>
-              <w:pBdr>
-                <w:bottom w:val="none" w:sz="0" w:space="0" w:color="000000"/>
-                <w:top w:val="none" w:sz="0" w:space="0" w:color="000000"/>
-                <w:left w:val="none" w:sz="0" w:space="0" w:color="000000"/>
-                <w:right w:val="none" w:sz="0" w:space="0" w:color="000000"/>
-              </w:pBdr>
-              <w:spacing w:after="100" w:before="100" w:line="240"/>
-              <w:ind w:left="100" w:right="100" w:firstLine="0" w:firstLineChars="0"/>
-              <w:rPr>
-                <w:rFonts w:ascii="Helvetica" w:hAnsi="Helvetica" w:eastAsia="Helvetica" w:cs="Helvetica"/>
-                <w:i w:val="false"/>
-                <w:b w:val="true"/>
-                <w:u w:val="none"/>
-                <w:strike w:val="false"/>
-                <w:sz w:val="22"/>
-                <w:szCs w:val="22"/>
-                <w:color w:val="000000"/>
-              </w:rPr>
-            </w:pPr>
-            <w:r>
-              <w:rPr>
-                <w:rFonts w:ascii="Helvetica" w:hAnsi="Helvetica" w:eastAsia="Helvetica" w:cs="Helvetica"/>
-                <w:i w:val="false"/>
-                <w:b w:val="true"/>
-                <w:u w:val="none"/>
-                <w:strike w:val="false"/>
-                <w:sz w:val="22"/>
-                <w:szCs w:val="22"/>
-                <w:color w:val="000000"/>
-              </w:rPr>
-              <w:t xml:space="preserve"/>
-            </w:r>
-          </w:p>
-        </w:tc>
-        <w:tc>
-          <w:tcPr>
-            <w:tcBorders>
-              <w:bottom w:val="none" w:sz="0" w:space="0" w:color="000000"/>
-              <w:top w:val="none" w:sz="0" w:space="0" w:color="000000"/>
-              <w:left w:val="none" w:sz="0" w:space="0" w:color="000000"/>
-              <w:right w:val="none" w:sz="0" w:space="0" w:color="000000"/>
-            </w:tcBorders>
-            <w:shd w:val="clear" w:color="auto" w:fill="FFFFFF"/>
-            <w:tcMar>
-              <w:top w:w="0" w:type="dxa"/>
-              <w:bottom w:w="0" w:type="dxa"/>
-              <w:left w:w="0" w:type="dxa"/>
-              <w:right w:w="0" w:type="dxa"/>
-            </w:tcMar>
-            <w:vAlign w:val="center"/>
-          </w:tcPr>
-          <w:p>
-            <w:pPr>
-              <w:jc w:val="center"/>
-              <w:pBdr>
-                <w:bottom w:val="none" w:sz="0" w:space="0" w:color="000000"/>
-                <w:top w:val="none" w:sz="0" w:space="0" w:color="000000"/>
-                <w:left w:val="none" w:sz="0" w:space="0" w:color="000000"/>
-                <w:right w:val="none" w:sz="0" w:space="0" w:color="000000"/>
-              </w:pBdr>
-              <w:spacing w:after="100" w:before="100" w:line="240"/>
-              <w:ind w:left="100" w:right="100" w:firstLine="0" w:firstLineChars="0"/>
-              <w:rPr>
-                <w:rFonts w:ascii="Helvetica" w:hAnsi="Helvetica" w:eastAsia="Helvetica" w:cs="Helvetica"/>
-                <w:i w:val="false"/>
-                <w:b w:val="true"/>
-                <w:u w:val="none"/>
-                <w:strike w:val="false"/>
-                <w:sz w:val="22"/>
-                <w:szCs w:val="22"/>
-                <w:color w:val="000000"/>
-              </w:rPr>
-            </w:pPr>
-            <w:r>
-              <w:rPr>
-                <w:rFonts w:ascii="Helvetica" w:hAnsi="Helvetica" w:eastAsia="Helvetica" w:cs="Helvetica"/>
-                <w:i w:val="false"/>
-                <w:b w:val="true"/>
-                <w:u w:val="none"/>
-                <w:strike w:val="false"/>
-                <w:sz w:val="22"/>
-                <w:szCs w:val="22"/>
-                <w:color w:val="000000"/>
-              </w:rPr>
-              <w:t xml:space="preserve"/>
+              <w:t xml:space="preserve">  139.0 (98.0 – 272.5)</w:t>
+            </w:r>
+          </w:p>
+        </w:tc>
+        <w:tc>
+          <w:tcPr>
+            <w:tcBorders>
+              <w:bottom w:val="none" w:sz="0" w:space="0" w:color="000000"/>
+              <w:top w:val="none" w:sz="0" w:space="0" w:color="000000"/>
+              <w:left w:val="none" w:sz="0" w:space="0" w:color="000000"/>
+              <w:right w:val="none" w:sz="0" w:space="0" w:color="000000"/>
+            </w:tcBorders>
+            <w:shd w:val="clear" w:color="auto" w:fill="FFFFFF"/>
+            <w:tcMar>
+              <w:top w:w="0" w:type="dxa"/>
+              <w:bottom w:w="0" w:type="dxa"/>
+              <w:left w:w="0" w:type="dxa"/>
+              <w:right w:w="0" w:type="dxa"/>
+            </w:tcMar>
+            <w:vAlign w:val="center"/>
+          </w:tcPr>
+          <w:p>
+            <w:pPr>
+              <w:jc w:val="center"/>
+              <w:pBdr>
+                <w:bottom w:val="none" w:sz="0" w:space="0" w:color="000000"/>
+                <w:top w:val="none" w:sz="0" w:space="0" w:color="000000"/>
+                <w:left w:val="none" w:sz="0" w:space="0" w:color="000000"/>
+                <w:right w:val="none" w:sz="0" w:space="0" w:color="000000"/>
+              </w:pBdr>
+              <w:spacing w:after="100" w:before="100" w:line="240"/>
+              <w:ind w:left="100" w:right="100" w:firstLine="0" w:firstLineChars="0"/>
+              <w:rPr>
+                <w:rFonts w:ascii="Helvetica" w:hAnsi="Helvetica" w:eastAsia="Helvetica" w:cs="Helvetica"/>
+                <w:i w:val="false"/>
+                <w:b w:val="false"/>
+                <w:u w:val="none"/>
+                <w:strike w:val="false"/>
+                <w:sz w:val="22"/>
+                <w:szCs w:val="22"/>
+                <w:color w:val="000000"/>
+              </w:rPr>
+            </w:pPr>
+            <w:r>
+              <w:rPr>
+                <w:rFonts w:ascii="Helvetica" w:hAnsi="Helvetica" w:eastAsia="Helvetica" w:cs="Helvetica"/>
+                <w:i w:val="false"/>
+                <w:b w:val="false"/>
+                <w:u w:val="none"/>
+                <w:strike w:val="false"/>
+                <w:sz w:val="22"/>
+                <w:szCs w:val="22"/>
+                <w:color w:val="000000"/>
+              </w:rPr>
+              <w:t xml:space="preserve"> 208.5 (149.5 – 272.2)</w:t>
+            </w:r>
+          </w:p>
+        </w:tc>
+        <w:tc>
+          <w:tcPr>
+            <w:tcBorders>
+              <w:bottom w:val="none" w:sz="0" w:space="0" w:color="000000"/>
+              <w:top w:val="none" w:sz="0" w:space="0" w:color="000000"/>
+              <w:left w:val="none" w:sz="0" w:space="0" w:color="000000"/>
+              <w:right w:val="none" w:sz="0" w:space="0" w:color="000000"/>
+            </w:tcBorders>
+            <w:shd w:val="clear" w:color="auto" w:fill="FFFFFF"/>
+            <w:tcMar>
+              <w:top w:w="0" w:type="dxa"/>
+              <w:bottom w:w="0" w:type="dxa"/>
+              <w:left w:w="0" w:type="dxa"/>
+              <w:right w:w="0" w:type="dxa"/>
+            </w:tcMar>
+            <w:vAlign w:val="center"/>
+          </w:tcPr>
+          <w:p>
+            <w:pPr>
+              <w:jc w:val="center"/>
+              <w:pBdr>
+                <w:bottom w:val="none" w:sz="0" w:space="0" w:color="000000"/>
+                <w:top w:val="none" w:sz="0" w:space="0" w:color="000000"/>
+                <w:left w:val="none" w:sz="0" w:space="0" w:color="000000"/>
+                <w:right w:val="none" w:sz="0" w:space="0" w:color="000000"/>
+              </w:pBdr>
+              <w:spacing w:after="100" w:before="100" w:line="240"/>
+              <w:ind w:left="100" w:right="100" w:firstLine="0" w:firstLineChars="0"/>
+              <w:rPr>
+                <w:rFonts w:ascii="Helvetica" w:hAnsi="Helvetica" w:eastAsia="Helvetica" w:cs="Helvetica"/>
+                <w:i w:val="false"/>
+                <w:b w:val="false"/>
+                <w:u w:val="none"/>
+                <w:strike w:val="false"/>
+                <w:sz w:val="22"/>
+                <w:szCs w:val="22"/>
+                <w:color w:val="000000"/>
+              </w:rPr>
+            </w:pPr>
+            <w:r>
+              <w:rPr>
+                <w:rFonts w:ascii="Helvetica" w:hAnsi="Helvetica" w:eastAsia="Helvetica" w:cs="Helvetica"/>
+                <w:i w:val="false"/>
+                <w:b w:val="false"/>
+                <w:u w:val="none"/>
+                <w:strike w:val="false"/>
+                <w:sz w:val="22"/>
+                <w:szCs w:val="22"/>
+                <w:color w:val="000000"/>
+              </w:rPr>
+              <w:t xml:space="preserve">-40 (-96 – 26)</w:t>
             </w:r>
           </w:p>
         </w:tc>
@@ -9707,6 +9707,282 @@
           <w:trHeight w:val="411" w:hRule="auto"/>
         </w:trPr>
         body35
+        <w:tc>
+          <w:tcPr>
+            <w:tcBorders>
+              <w:bottom w:val="none" w:sz="0" w:space="0" w:color="000000"/>
+              <w:top w:val="none" w:sz="0" w:space="0" w:color="000000"/>
+              <w:left w:val="none" w:sz="0" w:space="0" w:color="000000"/>
+              <w:right w:val="none" w:sz="0" w:space="0" w:color="000000"/>
+            </w:tcBorders>
+            <w:shd w:val="clear" w:color="auto" w:fill="FFFFFF"/>
+            <w:tcMar>
+              <w:top w:w="0" w:type="dxa"/>
+              <w:bottom w:w="0" w:type="dxa"/>
+              <w:left w:w="0" w:type="dxa"/>
+              <w:right w:w="0" w:type="dxa"/>
+            </w:tcMar>
+            <w:vAlign w:val="center"/>
+          </w:tcPr>
+          <w:p>
+            <w:pPr>
+              <w:jc w:val="left"/>
+              <w:pBdr>
+                <w:bottom w:val="none" w:sz="0" w:space="0" w:color="000000"/>
+                <w:top w:val="none" w:sz="0" w:space="0" w:color="000000"/>
+                <w:left w:val="none" w:sz="0" w:space="0" w:color="000000"/>
+                <w:right w:val="none" w:sz="0" w:space="0" w:color="000000"/>
+              </w:pBdr>
+              <w:spacing w:after="100" w:before="100" w:line="240"/>
+              <w:ind w:left="100" w:right="100" w:firstLine="0" w:firstLineChars="0"/>
+              <w:rPr>
+                <w:rFonts w:ascii="Helvetica" w:hAnsi="Helvetica" w:eastAsia="Helvetica" w:cs="Helvetica"/>
+                <w:i w:val="false"/>
+                <w:b w:val="true"/>
+                <w:u w:val="none"/>
+                <w:strike w:val="false"/>
+                <w:sz w:val="22"/>
+                <w:szCs w:val="22"/>
+                <w:color w:val="000000"/>
+              </w:rPr>
+            </w:pPr>
+            <w:r>
+              <w:rPr>
+                <w:rFonts w:ascii="Helvetica" w:hAnsi="Helvetica" w:eastAsia="Helvetica" w:cs="Helvetica"/>
+                <w:i w:val="false"/>
+                <w:b w:val="true"/>
+                <w:u w:val="none"/>
+                <w:strike w:val="false"/>
+                <w:sz w:val="22"/>
+                <w:szCs w:val="22"/>
+                <w:color w:val="000000"/>
+              </w:rPr>
+              <w:t xml:space="preserve"/>
+            </w:r>
+          </w:p>
+        </w:tc>
+        <w:tc>
+          <w:tcPr>
+            <w:tcBorders>
+              <w:bottom w:val="none" w:sz="0" w:space="0" w:color="000000"/>
+              <w:top w:val="none" w:sz="0" w:space="0" w:color="000000"/>
+              <w:left w:val="none" w:sz="0" w:space="0" w:color="000000"/>
+              <w:right w:val="none" w:sz="0" w:space="0" w:color="000000"/>
+            </w:tcBorders>
+            <w:shd w:val="clear" w:color="auto" w:fill="FFFFFF"/>
+            <w:tcMar>
+              <w:top w:w="0" w:type="dxa"/>
+              <w:bottom w:w="0" w:type="dxa"/>
+              <w:left w:w="0" w:type="dxa"/>
+              <w:right w:w="0" w:type="dxa"/>
+            </w:tcMar>
+            <w:vAlign w:val="center"/>
+          </w:tcPr>
+          <w:p>
+            <w:pPr>
+              <w:jc w:val="center"/>
+              <w:pBdr>
+                <w:bottom w:val="none" w:sz="0" w:space="0" w:color="000000"/>
+                <w:top w:val="none" w:sz="0" w:space="0" w:color="000000"/>
+                <w:left w:val="none" w:sz="0" w:space="0" w:color="000000"/>
+                <w:right w:val="none" w:sz="0" w:space="0" w:color="000000"/>
+              </w:pBdr>
+              <w:spacing w:after="100" w:before="100" w:line="240"/>
+              <w:ind w:left="100" w:right="100" w:firstLine="0" w:firstLineChars="0"/>
+              <w:rPr>
+                <w:rFonts w:ascii="Helvetica" w:hAnsi="Helvetica" w:eastAsia="Helvetica" w:cs="Helvetica"/>
+                <w:i w:val="false"/>
+                <w:b w:val="true"/>
+                <w:u w:val="none"/>
+                <w:strike w:val="false"/>
+                <w:sz w:val="22"/>
+                <w:szCs w:val="22"/>
+                <w:color w:val="000000"/>
+              </w:rPr>
+            </w:pPr>
+            <w:r>
+              <w:rPr>
+                <w:rFonts w:ascii="Helvetica" w:hAnsi="Helvetica" w:eastAsia="Helvetica" w:cs="Helvetica"/>
+                <w:i w:val="false"/>
+                <w:b w:val="true"/>
+                <w:u w:val="none"/>
+                <w:strike w:val="false"/>
+                <w:sz w:val="22"/>
+                <w:szCs w:val="22"/>
+                <w:color w:val="000000"/>
+              </w:rPr>
+              <w:t xml:space="preserve"/>
+            </w:r>
+          </w:p>
+        </w:tc>
+        <w:tc>
+          <w:tcPr>
+            <w:tcBorders>
+              <w:bottom w:val="none" w:sz="0" w:space="0" w:color="000000"/>
+              <w:top w:val="none" w:sz="0" w:space="0" w:color="000000"/>
+              <w:left w:val="none" w:sz="0" w:space="0" w:color="000000"/>
+              <w:right w:val="none" w:sz="0" w:space="0" w:color="000000"/>
+            </w:tcBorders>
+            <w:shd w:val="clear" w:color="auto" w:fill="FFFFFF"/>
+            <w:tcMar>
+              <w:top w:w="0" w:type="dxa"/>
+              <w:bottom w:w="0" w:type="dxa"/>
+              <w:left w:w="0" w:type="dxa"/>
+              <w:right w:w="0" w:type="dxa"/>
+            </w:tcMar>
+            <w:vAlign w:val="center"/>
+          </w:tcPr>
+          <w:p>
+            <w:pPr>
+              <w:jc w:val="center"/>
+              <w:pBdr>
+                <w:bottom w:val="none" w:sz="0" w:space="0" w:color="000000"/>
+                <w:top w:val="none" w:sz="0" w:space="0" w:color="000000"/>
+                <w:left w:val="none" w:sz="0" w:space="0" w:color="000000"/>
+                <w:right w:val="none" w:sz="0" w:space="0" w:color="000000"/>
+              </w:pBdr>
+              <w:spacing w:after="100" w:before="100" w:line="240"/>
+              <w:ind w:left="100" w:right="100" w:firstLine="0" w:firstLineChars="0"/>
+              <w:rPr>
+                <w:rFonts w:ascii="Helvetica" w:hAnsi="Helvetica" w:eastAsia="Helvetica" w:cs="Helvetica"/>
+                <w:i w:val="false"/>
+                <w:b w:val="true"/>
+                <w:u w:val="none"/>
+                <w:strike w:val="false"/>
+                <w:sz w:val="22"/>
+                <w:szCs w:val="22"/>
+                <w:color w:val="000000"/>
+              </w:rPr>
+            </w:pPr>
+            <w:r>
+              <w:rPr>
+                <w:rFonts w:ascii="Helvetica" w:hAnsi="Helvetica" w:eastAsia="Helvetica" w:cs="Helvetica"/>
+                <w:i w:val="false"/>
+                <w:b w:val="true"/>
+                <w:u w:val="none"/>
+                <w:strike w:val="false"/>
+                <w:sz w:val="22"/>
+                <w:szCs w:val="22"/>
+                <w:color w:val="000000"/>
+              </w:rPr>
+              <w:t xml:space="preserve"/>
+            </w:r>
+          </w:p>
+        </w:tc>
+        <w:tc>
+          <w:tcPr>
+            <w:tcBorders>
+              <w:bottom w:val="none" w:sz="0" w:space="0" w:color="000000"/>
+              <w:top w:val="none" w:sz="0" w:space="0" w:color="000000"/>
+              <w:left w:val="none" w:sz="0" w:space="0" w:color="000000"/>
+              <w:right w:val="none" w:sz="0" w:space="0" w:color="000000"/>
+            </w:tcBorders>
+            <w:shd w:val="clear" w:color="auto" w:fill="FFFFFF"/>
+            <w:tcMar>
+              <w:top w:w="0" w:type="dxa"/>
+              <w:bottom w:w="0" w:type="dxa"/>
+              <w:left w:w="0" w:type="dxa"/>
+              <w:right w:w="0" w:type="dxa"/>
+            </w:tcMar>
+            <w:vAlign w:val="center"/>
+          </w:tcPr>
+          <w:p>
+            <w:pPr>
+              <w:jc w:val="center"/>
+              <w:pBdr>
+                <w:bottom w:val="none" w:sz="0" w:space="0" w:color="000000"/>
+                <w:top w:val="none" w:sz="0" w:space="0" w:color="000000"/>
+                <w:left w:val="none" w:sz="0" w:space="0" w:color="000000"/>
+                <w:right w:val="none" w:sz="0" w:space="0" w:color="000000"/>
+              </w:pBdr>
+              <w:spacing w:after="100" w:before="100" w:line="240"/>
+              <w:ind w:left="100" w:right="100" w:firstLine="0" w:firstLineChars="0"/>
+              <w:rPr>
+                <w:rFonts w:ascii="Helvetica" w:hAnsi="Helvetica" w:eastAsia="Helvetica" w:cs="Helvetica"/>
+                <w:i w:val="false"/>
+                <w:b w:val="true"/>
+                <w:u w:val="none"/>
+                <w:strike w:val="false"/>
+                <w:sz w:val="22"/>
+                <w:szCs w:val="22"/>
+                <w:color w:val="000000"/>
+              </w:rPr>
+            </w:pPr>
+            <w:r>
+              <w:rPr>
+                <w:rFonts w:ascii="Helvetica" w:hAnsi="Helvetica" w:eastAsia="Helvetica" w:cs="Helvetica"/>
+                <w:i w:val="false"/>
+                <w:b w:val="true"/>
+                <w:u w:val="none"/>
+                <w:strike w:val="false"/>
+                <w:sz w:val="22"/>
+                <w:szCs w:val="22"/>
+                <w:color w:val="000000"/>
+              </w:rPr>
+              <w:t xml:space="preserve"/>
+            </w:r>
+          </w:p>
+        </w:tc>
+        <w:tc>
+          <w:tcPr>
+            <w:tcBorders>
+              <w:bottom w:val="none" w:sz="0" w:space="0" w:color="000000"/>
+              <w:top w:val="none" w:sz="0" w:space="0" w:color="000000"/>
+              <w:left w:val="none" w:sz="0" w:space="0" w:color="000000"/>
+              <w:right w:val="none" w:sz="0" w:space="0" w:color="000000"/>
+            </w:tcBorders>
+            <w:shd w:val="clear" w:color="auto" w:fill="FFFFFF"/>
+            <w:tcMar>
+              <w:top w:w="0" w:type="dxa"/>
+              <w:bottom w:w="0" w:type="dxa"/>
+              <w:left w:w="0" w:type="dxa"/>
+              <w:right w:w="0" w:type="dxa"/>
+            </w:tcMar>
+            <w:vAlign w:val="center"/>
+          </w:tcPr>
+          <w:p>
+            <w:pPr>
+              <w:jc w:val="center"/>
+              <w:pBdr>
+                <w:bottom w:val="none" w:sz="0" w:space="0" w:color="000000"/>
+                <w:top w:val="none" w:sz="0" w:space="0" w:color="000000"/>
+                <w:left w:val="none" w:sz="0" w:space="0" w:color="000000"/>
+                <w:right w:val="none" w:sz="0" w:space="0" w:color="000000"/>
+              </w:pBdr>
+              <w:spacing w:after="100" w:before="100" w:line="240"/>
+              <w:ind w:left="100" w:right="100" w:firstLine="0" w:firstLineChars="0"/>
+              <w:rPr>
+                <w:rFonts w:ascii="Helvetica" w:hAnsi="Helvetica" w:eastAsia="Helvetica" w:cs="Helvetica"/>
+                <w:i w:val="false"/>
+                <w:b w:val="true"/>
+                <w:u w:val="none"/>
+                <w:strike w:val="false"/>
+                <w:sz w:val="22"/>
+                <w:szCs w:val="22"/>
+                <w:color w:val="000000"/>
+              </w:rPr>
+            </w:pPr>
+            <w:r>
+              <w:rPr>
+                <w:rFonts w:ascii="Helvetica" w:hAnsi="Helvetica" w:eastAsia="Helvetica" w:cs="Helvetica"/>
+                <w:i w:val="false"/>
+                <w:b w:val="true"/>
+                <w:u w:val="none"/>
+                <w:strike w:val="false"/>
+                <w:sz w:val="22"/>
+                <w:szCs w:val="22"/>
+                <w:color w:val="000000"/>
+              </w:rPr>
+              <w:t xml:space="preserve"/>
+            </w:r>
+          </w:p>
+        </w:tc>
+      </w:tr>
+      <w:tr>
+        <w:trPr>
+          <w:trHeight w:val="411" w:hRule="auto"/>
+        </w:trPr>
+        body36
         <w:tc>
           <w:tcPr>
             <w:tcBorders>

</xml_diff>